<commit_message>
Update a new interface with product status is displayed
</commit_message>
<xml_diff>
--- a/assets/thesis/ElectronicProductsStaticWebsite.docx
+++ b/assets/thesis/ElectronicProductsStaticWebsite.docx
@@ -1211,17 +1211,9 @@
         <w:tabs>
           <w:tab w:val="left" w:leader="dot" w:pos="8505"/>
         </w:tabs>
-      </w:pPr>
-      <w:r>
-        <w:tab/>
-      </w:r>
-    </w:p>
-    <w:p>
-      <w:pPr>
-        <w:pStyle w:val="noidung"/>
-        <w:tabs>
-          <w:tab w:val="left" w:leader="dot" w:pos="8505"/>
-        </w:tabs>
+        <w:rPr>
+          <w:lang w:val="en-US"/>
+        </w:rPr>
       </w:pPr>
       <w:r>
         <w:tab/>
@@ -1451,14 +1443,10 @@
         <w:tabs>
           <w:tab w:val="left" w:pos="8505"/>
         </w:tabs>
-      </w:pPr>
-    </w:p>
-    <w:p>
-      <w:pPr>
-        <w:pStyle w:val="noidung"/>
-        <w:tabs>
-          <w:tab w:val="left" w:pos="8505"/>
-        </w:tabs>
+        <w:ind w:firstLine="0"/>
+        <w:rPr>
+          <w:lang w:val="en-US"/>
+        </w:rPr>
       </w:pPr>
     </w:p>
     <w:p>
@@ -1503,7 +1491,7 @@
       <w:r>
         <w:fldChar w:fldCharType="separate"/>
       </w:r>
-      <w:hyperlink w:anchor="_Toc231803055" w:history="1">
+      <w:hyperlink w:anchor="_Toc231814578" w:history="1">
         <w:r>
           <w:rPr>
             <w:rStyle w:val="Hyperlink"/>
@@ -1526,7 +1514,7 @@
           <w:rPr>
             <w:webHidden/>
           </w:rPr>
-          <w:instrText xml:space="preserve"> PAGEREF _Toc231803055 \h </w:instrText>
+          <w:instrText xml:space="preserve"> PAGEREF _Toc231814578 \h </w:instrText>
         </w:r>
         <w:r>
           <w:rPr>
@@ -1568,7 +1556,7 @@
           <w14:ligatures w14:val="standardContextual"/>
         </w:rPr>
       </w:pPr>
-      <w:hyperlink w:anchor="_Toc231803056" w:history="1">
+      <w:hyperlink w:anchor="_Toc231814579" w:history="1">
         <w:r>
           <w:rPr>
             <w:rStyle w:val="Hyperlink"/>
@@ -1591,7 +1579,7 @@
           <w:rPr>
             <w:webHidden/>
           </w:rPr>
-          <w:instrText xml:space="preserve"> PAGEREF _Toc231803056 \h </w:instrText>
+          <w:instrText xml:space="preserve"> PAGEREF _Toc231814579 \h </w:instrText>
         </w:r>
         <w:r>
           <w:rPr>
@@ -1633,7 +1621,7 @@
           <w14:ligatures w14:val="standardContextual"/>
         </w:rPr>
       </w:pPr>
-      <w:hyperlink w:anchor="_Toc231803057" w:history="1">
+      <w:hyperlink w:anchor="_Toc231814580" w:history="1">
         <w:r>
           <w:rPr>
             <w:rStyle w:val="Hyperlink"/>
@@ -1656,7 +1644,7 @@
           <w:rPr>
             <w:webHidden/>
           </w:rPr>
-          <w:instrText xml:space="preserve"> PAGEREF _Toc231803057 \h </w:instrText>
+          <w:instrText xml:space="preserve"> PAGEREF _Toc231814580 \h </w:instrText>
         </w:r>
         <w:r>
           <w:rPr>
@@ -1698,7 +1686,7 @@
           <w14:ligatures w14:val="standardContextual"/>
         </w:rPr>
       </w:pPr>
-      <w:hyperlink w:anchor="_Toc231803058" w:history="1">
+      <w:hyperlink w:anchor="_Toc231814581" w:history="1">
         <w:r>
           <w:rPr>
             <w:rStyle w:val="Hyperlink"/>
@@ -1721,7 +1709,7 @@
           <w:rPr>
             <w:webHidden/>
           </w:rPr>
-          <w:instrText xml:space="preserve"> PAGEREF _Toc231803058 \h </w:instrText>
+          <w:instrText xml:space="preserve"> PAGEREF _Toc231814581 \h </w:instrText>
         </w:r>
         <w:r>
           <w:rPr>
@@ -1763,7 +1751,7 @@
           <w14:ligatures w14:val="standardContextual"/>
         </w:rPr>
       </w:pPr>
-      <w:hyperlink w:anchor="_Toc231803059" w:history="1">
+      <w:hyperlink w:anchor="_Toc231814582" w:history="1">
         <w:r>
           <w:rPr>
             <w:rStyle w:val="Hyperlink"/>
@@ -1786,7 +1774,7 @@
           <w:rPr>
             <w:webHidden/>
           </w:rPr>
-          <w:instrText xml:space="preserve"> PAGEREF _Toc231803059 \h </w:instrText>
+          <w:instrText xml:space="preserve"> PAGEREF _Toc231814582 \h </w:instrText>
         </w:r>
         <w:r>
           <w:rPr>
@@ -1828,7 +1816,7 @@
           <w14:ligatures w14:val="standardContextual"/>
         </w:rPr>
       </w:pPr>
-      <w:hyperlink w:anchor="_Toc231803060" w:history="1">
+      <w:hyperlink w:anchor="_Toc231814583" w:history="1">
         <w:r>
           <w:rPr>
             <w:rStyle w:val="Hyperlink"/>
@@ -1851,7 +1839,7 @@
           <w:rPr>
             <w:webHidden/>
           </w:rPr>
-          <w:instrText xml:space="preserve"> PAGEREF _Toc231803060 \h </w:instrText>
+          <w:instrText xml:space="preserve"> PAGEREF _Toc231814583 \h </w:instrText>
         </w:r>
         <w:r>
           <w:rPr>
@@ -1893,7 +1881,7 @@
           <w14:ligatures w14:val="standardContextual"/>
         </w:rPr>
       </w:pPr>
-      <w:hyperlink w:anchor="_Toc231803061" w:history="1">
+      <w:hyperlink w:anchor="_Toc231814584" w:history="1">
         <w:r>
           <w:rPr>
             <w:rStyle w:val="Hyperlink"/>
@@ -1916,7 +1904,7 @@
           <w:rPr>
             <w:webHidden/>
           </w:rPr>
-          <w:instrText xml:space="preserve"> PAGEREF _Toc231803061 \h </w:instrText>
+          <w:instrText xml:space="preserve"> PAGEREF _Toc231814584 \h </w:instrText>
         </w:r>
         <w:r>
           <w:rPr>
@@ -1958,7 +1946,7 @@
           <w14:ligatures w14:val="standardContextual"/>
         </w:rPr>
       </w:pPr>
-      <w:hyperlink w:anchor="_Toc231803062" w:history="1">
+      <w:hyperlink w:anchor="_Toc231814585" w:history="1">
         <w:r>
           <w:rPr>
             <w:rStyle w:val="Hyperlink"/>
@@ -1981,7 +1969,7 @@
           <w:rPr>
             <w:webHidden/>
           </w:rPr>
-          <w:instrText xml:space="preserve"> PAGEREF _Toc231803062 \h </w:instrText>
+          <w:instrText xml:space="preserve"> PAGEREF _Toc231814585 \h </w:instrText>
         </w:r>
         <w:r>
           <w:rPr>
@@ -2023,7 +2011,7 @@
           <w14:ligatures w14:val="standardContextual"/>
         </w:rPr>
       </w:pPr>
-      <w:hyperlink w:anchor="_Toc231803063" w:history="1">
+      <w:hyperlink w:anchor="_Toc231814586" w:history="1">
         <w:r>
           <w:rPr>
             <w:rStyle w:val="Hyperlink"/>
@@ -2046,7 +2034,7 @@
           <w:rPr>
             <w:webHidden/>
           </w:rPr>
-          <w:instrText xml:space="preserve"> PAGEREF _Toc231803063 \h </w:instrText>
+          <w:instrText xml:space="preserve"> PAGEREF _Toc231814586 \h </w:instrText>
         </w:r>
         <w:r>
           <w:rPr>
@@ -2088,7 +2076,7 @@
           <w14:ligatures w14:val="standardContextual"/>
         </w:rPr>
       </w:pPr>
-      <w:hyperlink w:anchor="_Toc231803064" w:history="1">
+      <w:hyperlink w:anchor="_Toc231814587" w:history="1">
         <w:r>
           <w:rPr>
             <w:rStyle w:val="Hyperlink"/>
@@ -2111,7 +2099,7 @@
           <w:rPr>
             <w:webHidden/>
           </w:rPr>
-          <w:instrText xml:space="preserve"> PAGEREF _Toc231803064 \h </w:instrText>
+          <w:instrText xml:space="preserve"> PAGEREF _Toc231814587 \h </w:instrText>
         </w:r>
         <w:r>
           <w:rPr>
@@ -2153,7 +2141,7 @@
           <w14:ligatures w14:val="standardContextual"/>
         </w:rPr>
       </w:pPr>
-      <w:hyperlink w:anchor="_Toc231803065" w:history="1">
+      <w:hyperlink w:anchor="_Toc231814588" w:history="1">
         <w:r>
           <w:rPr>
             <w:rStyle w:val="Hyperlink"/>
@@ -2176,7 +2164,7 @@
           <w:rPr>
             <w:webHidden/>
           </w:rPr>
-          <w:instrText xml:space="preserve"> PAGEREF _Toc231803065 \h </w:instrText>
+          <w:instrText xml:space="preserve"> PAGEREF _Toc231814588 \h </w:instrText>
         </w:r>
         <w:r>
           <w:rPr>
@@ -2218,7 +2206,7 @@
           <w14:ligatures w14:val="standardContextual"/>
         </w:rPr>
       </w:pPr>
-      <w:hyperlink w:anchor="_Toc231803066" w:history="1">
+      <w:hyperlink w:anchor="_Toc231814589" w:history="1">
         <w:r>
           <w:rPr>
             <w:rStyle w:val="Hyperlink"/>
@@ -2241,7 +2229,7 @@
           <w:rPr>
             <w:webHidden/>
           </w:rPr>
-          <w:instrText xml:space="preserve"> PAGEREF _Toc231803066 \h </w:instrText>
+          <w:instrText xml:space="preserve"> PAGEREF _Toc231814589 \h </w:instrText>
         </w:r>
         <w:r>
           <w:rPr>
@@ -2283,7 +2271,7 @@
           <w14:ligatures w14:val="standardContextual"/>
         </w:rPr>
       </w:pPr>
-      <w:hyperlink w:anchor="_Toc231803067" w:history="1">
+      <w:hyperlink w:anchor="_Toc231814590" w:history="1">
         <w:r>
           <w:rPr>
             <w:rStyle w:val="Hyperlink"/>
@@ -2306,7 +2294,7 @@
           <w:rPr>
             <w:webHidden/>
           </w:rPr>
-          <w:instrText xml:space="preserve"> PAGEREF _Toc231803067 \h </w:instrText>
+          <w:instrText xml:space="preserve"> PAGEREF _Toc231814590 \h </w:instrText>
         </w:r>
         <w:r>
           <w:rPr>
@@ -2348,7 +2336,7 @@
           <w14:ligatures w14:val="standardContextual"/>
         </w:rPr>
       </w:pPr>
-      <w:hyperlink w:anchor="_Toc231803068" w:history="1">
+      <w:hyperlink w:anchor="_Toc231814591" w:history="1">
         <w:r>
           <w:rPr>
             <w:rStyle w:val="Hyperlink"/>
@@ -2371,7 +2359,7 @@
           <w:rPr>
             <w:webHidden/>
           </w:rPr>
-          <w:instrText xml:space="preserve"> PAGEREF _Toc231803068 \h </w:instrText>
+          <w:instrText xml:space="preserve"> PAGEREF _Toc231814591 \h </w:instrText>
         </w:r>
         <w:r>
           <w:rPr>
@@ -2413,7 +2401,7 @@
           <w14:ligatures w14:val="standardContextual"/>
         </w:rPr>
       </w:pPr>
-      <w:hyperlink w:anchor="_Toc231803069" w:history="1">
+      <w:hyperlink w:anchor="_Toc231814592" w:history="1">
         <w:r>
           <w:rPr>
             <w:rStyle w:val="Hyperlink"/>
@@ -2436,7 +2424,7 @@
           <w:rPr>
             <w:webHidden/>
           </w:rPr>
-          <w:instrText xml:space="preserve"> PAGEREF _Toc231803069 \h </w:instrText>
+          <w:instrText xml:space="preserve"> PAGEREF _Toc231814592 \h </w:instrText>
         </w:r>
         <w:r>
           <w:rPr>
@@ -2478,7 +2466,7 @@
           <w14:ligatures w14:val="standardContextual"/>
         </w:rPr>
       </w:pPr>
-      <w:hyperlink w:anchor="_Toc231803070" w:history="1">
+      <w:hyperlink w:anchor="_Toc231814593" w:history="1">
         <w:r>
           <w:rPr>
             <w:rStyle w:val="Hyperlink"/>
@@ -2501,7 +2489,7 @@
           <w:rPr>
             <w:webHidden/>
           </w:rPr>
-          <w:instrText xml:space="preserve"> PAGEREF _Toc231803070 \h </w:instrText>
+          <w:instrText xml:space="preserve"> PAGEREF _Toc231814593 \h </w:instrText>
         </w:r>
         <w:r>
           <w:rPr>
@@ -2543,7 +2531,7 @@
           <w14:ligatures w14:val="standardContextual"/>
         </w:rPr>
       </w:pPr>
-      <w:hyperlink w:anchor="_Toc231803071" w:history="1">
+      <w:hyperlink w:anchor="_Toc231814594" w:history="1">
         <w:r>
           <w:rPr>
             <w:rStyle w:val="Hyperlink"/>
@@ -2566,7 +2554,7 @@
           <w:rPr>
             <w:webHidden/>
           </w:rPr>
-          <w:instrText xml:space="preserve"> PAGEREF _Toc231803071 \h </w:instrText>
+          <w:instrText xml:space="preserve"> PAGEREF _Toc231814594 \h </w:instrText>
         </w:r>
         <w:r>
           <w:rPr>
@@ -2608,7 +2596,7 @@
           <w14:ligatures w14:val="standardContextual"/>
         </w:rPr>
       </w:pPr>
-      <w:hyperlink w:anchor="_Toc231803072" w:history="1">
+      <w:hyperlink w:anchor="_Toc231814595" w:history="1">
         <w:r>
           <w:rPr>
             <w:rStyle w:val="Hyperlink"/>
@@ -2631,7 +2619,7 @@
           <w:rPr>
             <w:webHidden/>
           </w:rPr>
-          <w:instrText xml:space="preserve"> PAGEREF _Toc231803072 \h </w:instrText>
+          <w:instrText xml:space="preserve"> PAGEREF _Toc231814595 \h </w:instrText>
         </w:r>
         <w:r>
           <w:rPr>
@@ -2673,7 +2661,7 @@
           <w14:ligatures w14:val="standardContextual"/>
         </w:rPr>
       </w:pPr>
-      <w:hyperlink w:anchor="_Toc231803073" w:history="1">
+      <w:hyperlink w:anchor="_Toc231814596" w:history="1">
         <w:r>
           <w:rPr>
             <w:rStyle w:val="Hyperlink"/>
@@ -2712,7 +2700,7 @@
           <w:rPr>
             <w:webHidden/>
           </w:rPr>
-          <w:instrText xml:space="preserve"> PAGEREF _Toc231803073 \h </w:instrText>
+          <w:instrText xml:space="preserve"> PAGEREF _Toc231814596 \h </w:instrText>
         </w:r>
         <w:r>
           <w:rPr>
@@ -2754,7 +2742,7 @@
           <w14:ligatures w14:val="standardContextual"/>
         </w:rPr>
       </w:pPr>
-      <w:hyperlink w:anchor="_Toc231803074" w:history="1">
+      <w:hyperlink w:anchor="_Toc231814597" w:history="1">
         <w:r>
           <w:rPr>
             <w:rStyle w:val="Hyperlink"/>
@@ -2777,7 +2765,7 @@
           <w:rPr>
             <w:webHidden/>
           </w:rPr>
-          <w:instrText xml:space="preserve"> PAGEREF _Toc231803074 \h </w:instrText>
+          <w:instrText xml:space="preserve"> PAGEREF _Toc231814597 \h </w:instrText>
         </w:r>
         <w:r>
           <w:rPr>
@@ -2819,7 +2807,7 @@
           <w14:ligatures w14:val="standardContextual"/>
         </w:rPr>
       </w:pPr>
-      <w:hyperlink w:anchor="_Toc231803075" w:history="1">
+      <w:hyperlink w:anchor="_Toc231814598" w:history="1">
         <w:r>
           <w:rPr>
             <w:rStyle w:val="Hyperlink"/>
@@ -2842,7 +2830,7 @@
           <w:rPr>
             <w:webHidden/>
           </w:rPr>
-          <w:instrText xml:space="preserve"> PAGEREF _Toc231803075 \h </w:instrText>
+          <w:instrText xml:space="preserve"> PAGEREF _Toc231814598 \h </w:instrText>
         </w:r>
         <w:r>
           <w:rPr>
@@ -2884,7 +2872,7 @@
           <w14:ligatures w14:val="standardContextual"/>
         </w:rPr>
       </w:pPr>
-      <w:hyperlink w:anchor="_Toc231803076" w:history="1">
+      <w:hyperlink w:anchor="_Toc231814599" w:history="1">
         <w:r>
           <w:rPr>
             <w:rStyle w:val="Hyperlink"/>
@@ -2907,7 +2895,7 @@
           <w:rPr>
             <w:webHidden/>
           </w:rPr>
-          <w:instrText xml:space="preserve"> PAGEREF _Toc231803076 \h </w:instrText>
+          <w:instrText xml:space="preserve"> PAGEREF _Toc231814599 \h </w:instrText>
         </w:r>
         <w:r>
           <w:rPr>
@@ -2949,7 +2937,7 @@
           <w14:ligatures w14:val="standardContextual"/>
         </w:rPr>
       </w:pPr>
-      <w:hyperlink w:anchor="_Toc231803077" w:history="1">
+      <w:hyperlink w:anchor="_Toc231814600" w:history="1">
         <w:r>
           <w:rPr>
             <w:rStyle w:val="Hyperlink"/>
@@ -2972,7 +2960,7 @@
           <w:rPr>
             <w:webHidden/>
           </w:rPr>
-          <w:instrText xml:space="preserve"> PAGEREF _Toc231803077 \h </w:instrText>
+          <w:instrText xml:space="preserve"> PAGEREF _Toc231814600 \h </w:instrText>
         </w:r>
         <w:r>
           <w:rPr>
@@ -3014,7 +3002,7 @@
           <w14:ligatures w14:val="standardContextual"/>
         </w:rPr>
       </w:pPr>
-      <w:hyperlink w:anchor="_Toc231803078" w:history="1">
+      <w:hyperlink w:anchor="_Toc231814601" w:history="1">
         <w:r>
           <w:rPr>
             <w:rStyle w:val="Hyperlink"/>
@@ -3037,7 +3025,7 @@
           <w:rPr>
             <w:webHidden/>
           </w:rPr>
-          <w:instrText xml:space="preserve"> PAGEREF _Toc231803078 \h </w:instrText>
+          <w:instrText xml:space="preserve"> PAGEREF _Toc231814601 \h </w:instrText>
         </w:r>
         <w:r>
           <w:rPr>
@@ -3079,7 +3067,7 @@
           <w14:ligatures w14:val="standardContextual"/>
         </w:rPr>
       </w:pPr>
-      <w:hyperlink w:anchor="_Toc231803079" w:history="1">
+      <w:hyperlink w:anchor="_Toc231814602" w:history="1">
         <w:r>
           <w:rPr>
             <w:rStyle w:val="Hyperlink"/>
@@ -3102,7 +3090,7 @@
           <w:rPr>
             <w:webHidden/>
           </w:rPr>
-          <w:instrText xml:space="preserve"> PAGEREF _Toc231803079 \h </w:instrText>
+          <w:instrText xml:space="preserve"> PAGEREF _Toc231814602 \h </w:instrText>
         </w:r>
         <w:r>
           <w:rPr>
@@ -3144,7 +3132,7 @@
           <w14:ligatures w14:val="standardContextual"/>
         </w:rPr>
       </w:pPr>
-      <w:hyperlink w:anchor="_Toc231803080" w:history="1">
+      <w:hyperlink w:anchor="_Toc231814603" w:history="1">
         <w:r>
           <w:rPr>
             <w:rStyle w:val="Hyperlink"/>
@@ -3167,7 +3155,7 @@
           <w:rPr>
             <w:webHidden/>
           </w:rPr>
-          <w:instrText xml:space="preserve"> PAGEREF _Toc231803080 \h </w:instrText>
+          <w:instrText xml:space="preserve"> PAGEREF _Toc231814603 \h </w:instrText>
         </w:r>
         <w:r>
           <w:rPr>
@@ -3209,7 +3197,7 @@
           <w14:ligatures w14:val="standardContextual"/>
         </w:rPr>
       </w:pPr>
-      <w:hyperlink w:anchor="_Toc231803081" w:history="1">
+      <w:hyperlink w:anchor="_Toc231814604" w:history="1">
         <w:r>
           <w:rPr>
             <w:rStyle w:val="Hyperlink"/>
@@ -3232,7 +3220,7 @@
           <w:rPr>
             <w:webHidden/>
           </w:rPr>
-          <w:instrText xml:space="preserve"> PAGEREF _Toc231803081 \h </w:instrText>
+          <w:instrText xml:space="preserve"> PAGEREF _Toc231814604 \h </w:instrText>
         </w:r>
         <w:r>
           <w:rPr>
@@ -3274,7 +3262,7 @@
           <w14:ligatures w14:val="standardContextual"/>
         </w:rPr>
       </w:pPr>
-      <w:hyperlink w:anchor="_Toc231803082" w:history="1">
+      <w:hyperlink w:anchor="_Toc231814605" w:history="1">
         <w:r>
           <w:rPr>
             <w:rStyle w:val="Hyperlink"/>
@@ -3297,7 +3285,7 @@
           <w:rPr>
             <w:webHidden/>
           </w:rPr>
-          <w:instrText xml:space="preserve"> PAGEREF _Toc231803082 \h </w:instrText>
+          <w:instrText xml:space="preserve"> PAGEREF _Toc231814605 \h </w:instrText>
         </w:r>
         <w:r>
           <w:rPr>
@@ -3339,7 +3327,7 @@
           <w14:ligatures w14:val="standardContextual"/>
         </w:rPr>
       </w:pPr>
-      <w:hyperlink w:anchor="_Toc231803083" w:history="1">
+      <w:hyperlink w:anchor="_Toc231814606" w:history="1">
         <w:r>
           <w:rPr>
             <w:rStyle w:val="Hyperlink"/>
@@ -3362,7 +3350,7 @@
           <w:rPr>
             <w:webHidden/>
           </w:rPr>
-          <w:instrText xml:space="preserve"> PAGEREF _Toc231803083 \h </w:instrText>
+          <w:instrText xml:space="preserve"> PAGEREF _Toc231814606 \h </w:instrText>
         </w:r>
         <w:r>
           <w:rPr>
@@ -3404,7 +3392,7 @@
           <w14:ligatures w14:val="standardContextual"/>
         </w:rPr>
       </w:pPr>
-      <w:hyperlink w:anchor="_Toc231803084" w:history="1">
+      <w:hyperlink w:anchor="_Toc231814607" w:history="1">
         <w:r>
           <w:rPr>
             <w:rStyle w:val="Hyperlink"/>
@@ -3427,7 +3415,7 @@
           <w:rPr>
             <w:webHidden/>
           </w:rPr>
-          <w:instrText xml:space="preserve"> PAGEREF _Toc231803084 \h </w:instrText>
+          <w:instrText xml:space="preserve"> PAGEREF _Toc231814607 \h </w:instrText>
         </w:r>
         <w:r>
           <w:rPr>
@@ -3469,7 +3457,7 @@
           <w14:ligatures w14:val="standardContextual"/>
         </w:rPr>
       </w:pPr>
-      <w:hyperlink w:anchor="_Toc231803085" w:history="1">
+      <w:hyperlink w:anchor="_Toc231814608" w:history="1">
         <w:r>
           <w:rPr>
             <w:rStyle w:val="Hyperlink"/>
@@ -3492,7 +3480,7 @@
           <w:rPr>
             <w:webHidden/>
           </w:rPr>
-          <w:instrText xml:space="preserve"> PAGEREF _Toc231803085 \h </w:instrText>
+          <w:instrText xml:space="preserve"> PAGEREF _Toc231814608 \h </w:instrText>
         </w:r>
         <w:r>
           <w:rPr>
@@ -3534,7 +3522,7 @@
           <w14:ligatures w14:val="standardContextual"/>
         </w:rPr>
       </w:pPr>
-      <w:hyperlink w:anchor="_Toc231803086" w:history="1">
+      <w:hyperlink w:anchor="_Toc231814609" w:history="1">
         <w:r>
           <w:rPr>
             <w:rStyle w:val="Hyperlink"/>
@@ -3557,7 +3545,7 @@
           <w:rPr>
             <w:webHidden/>
           </w:rPr>
-          <w:instrText xml:space="preserve"> PAGEREF _Toc231803086 \h </w:instrText>
+          <w:instrText xml:space="preserve"> PAGEREF _Toc231814609 \h </w:instrText>
         </w:r>
         <w:r>
           <w:rPr>
@@ -3599,7 +3587,7 @@
           <w14:ligatures w14:val="standardContextual"/>
         </w:rPr>
       </w:pPr>
-      <w:hyperlink w:anchor="_Toc231803087" w:history="1">
+      <w:hyperlink w:anchor="_Toc231814610" w:history="1">
         <w:r>
           <w:rPr>
             <w:rStyle w:val="Hyperlink"/>
@@ -3622,7 +3610,7 @@
           <w:rPr>
             <w:webHidden/>
           </w:rPr>
-          <w:instrText xml:space="preserve"> PAGEREF _Toc231803087 \h </w:instrText>
+          <w:instrText xml:space="preserve"> PAGEREF _Toc231814610 \h </w:instrText>
         </w:r>
         <w:r>
           <w:rPr>
@@ -3664,7 +3652,7 @@
           <w14:ligatures w14:val="standardContextual"/>
         </w:rPr>
       </w:pPr>
-      <w:hyperlink w:anchor="_Toc231803088" w:history="1">
+      <w:hyperlink w:anchor="_Toc231814611" w:history="1">
         <w:r>
           <w:rPr>
             <w:rStyle w:val="Hyperlink"/>
@@ -3687,7 +3675,7 @@
           <w:rPr>
             <w:webHidden/>
           </w:rPr>
-          <w:instrText xml:space="preserve"> PAGEREF _Toc231803088 \h </w:instrText>
+          <w:instrText xml:space="preserve"> PAGEREF _Toc231814611 \h </w:instrText>
         </w:r>
         <w:r>
           <w:rPr>
@@ -3729,7 +3717,7 @@
           <w14:ligatures w14:val="standardContextual"/>
         </w:rPr>
       </w:pPr>
-      <w:hyperlink w:anchor="_Toc231803089" w:history="1">
+      <w:hyperlink w:anchor="_Toc231814612" w:history="1">
         <w:r>
           <w:rPr>
             <w:rStyle w:val="Hyperlink"/>
@@ -3752,7 +3740,7 @@
           <w:rPr>
             <w:webHidden/>
           </w:rPr>
-          <w:instrText xml:space="preserve"> PAGEREF _Toc231803089 \h </w:instrText>
+          <w:instrText xml:space="preserve"> PAGEREF _Toc231814612 \h </w:instrText>
         </w:r>
         <w:r>
           <w:rPr>
@@ -3794,7 +3782,7 @@
           <w14:ligatures w14:val="standardContextual"/>
         </w:rPr>
       </w:pPr>
-      <w:hyperlink w:anchor="_Toc231803090" w:history="1">
+      <w:hyperlink w:anchor="_Toc231814613" w:history="1">
         <w:r>
           <w:rPr>
             <w:rStyle w:val="Hyperlink"/>
@@ -3817,7 +3805,7 @@
           <w:rPr>
             <w:webHidden/>
           </w:rPr>
-          <w:instrText xml:space="preserve"> PAGEREF _Toc231803090 \h </w:instrText>
+          <w:instrText xml:space="preserve"> PAGEREF _Toc231814613 \h </w:instrText>
         </w:r>
         <w:r>
           <w:rPr>
@@ -3859,7 +3847,7 @@
           <w14:ligatures w14:val="standardContextual"/>
         </w:rPr>
       </w:pPr>
-      <w:hyperlink w:anchor="_Toc231803091" w:history="1">
+      <w:hyperlink w:anchor="_Toc231814614" w:history="1">
         <w:r>
           <w:rPr>
             <w:rStyle w:val="Hyperlink"/>
@@ -3882,7 +3870,7 @@
           <w:rPr>
             <w:webHidden/>
           </w:rPr>
-          <w:instrText xml:space="preserve"> PAGEREF _Toc231803091 \h </w:instrText>
+          <w:instrText xml:space="preserve"> PAGEREF _Toc231814614 \h </w:instrText>
         </w:r>
         <w:r>
           <w:rPr>
@@ -3924,7 +3912,7 @@
           <w14:ligatures w14:val="standardContextual"/>
         </w:rPr>
       </w:pPr>
-      <w:hyperlink w:anchor="_Toc231803092" w:history="1">
+      <w:hyperlink w:anchor="_Toc231814615" w:history="1">
         <w:r>
           <w:rPr>
             <w:rStyle w:val="Hyperlink"/>
@@ -3947,7 +3935,7 @@
           <w:rPr>
             <w:webHidden/>
           </w:rPr>
-          <w:instrText xml:space="preserve"> PAGEREF _Toc231803092 \h </w:instrText>
+          <w:instrText xml:space="preserve"> PAGEREF _Toc231814615 \h </w:instrText>
         </w:r>
         <w:r>
           <w:rPr>
@@ -3989,7 +3977,7 @@
           <w14:ligatures w14:val="standardContextual"/>
         </w:rPr>
       </w:pPr>
-      <w:hyperlink w:anchor="_Toc231803093" w:history="1">
+      <w:hyperlink w:anchor="_Toc231814616" w:history="1">
         <w:r>
           <w:rPr>
             <w:rStyle w:val="Hyperlink"/>
@@ -4012,7 +4000,7 @@
           <w:rPr>
             <w:webHidden/>
           </w:rPr>
-          <w:instrText xml:space="preserve"> PAGEREF _Toc231803093 \h </w:instrText>
+          <w:instrText xml:space="preserve"> PAGEREF _Toc231814616 \h </w:instrText>
         </w:r>
         <w:r>
           <w:rPr>
@@ -4054,7 +4042,7 @@
           <w14:ligatures w14:val="standardContextual"/>
         </w:rPr>
       </w:pPr>
-      <w:hyperlink w:anchor="_Toc231803094" w:history="1">
+      <w:hyperlink w:anchor="_Toc231814617" w:history="1">
         <w:r>
           <w:rPr>
             <w:rStyle w:val="Hyperlink"/>
@@ -4077,7 +4065,7 @@
           <w:rPr>
             <w:webHidden/>
           </w:rPr>
-          <w:instrText xml:space="preserve"> PAGEREF _Toc231803094 \h </w:instrText>
+          <w:instrText xml:space="preserve"> PAGEREF _Toc231814617 \h </w:instrText>
         </w:r>
         <w:r>
           <w:rPr>
@@ -4119,7 +4107,7 @@
           <w14:ligatures w14:val="standardContextual"/>
         </w:rPr>
       </w:pPr>
-      <w:hyperlink w:anchor="_Toc231803095" w:history="1">
+      <w:hyperlink w:anchor="_Toc231814618" w:history="1">
         <w:r>
           <w:rPr>
             <w:rStyle w:val="Hyperlink"/>
@@ -4142,7 +4130,7 @@
           <w:rPr>
             <w:webHidden/>
           </w:rPr>
-          <w:instrText xml:space="preserve"> PAGEREF _Toc231803095 \h </w:instrText>
+          <w:instrText xml:space="preserve"> PAGEREF _Toc231814618 \h </w:instrText>
         </w:r>
         <w:r>
           <w:rPr>
@@ -4184,7 +4172,7 @@
           <w14:ligatures w14:val="standardContextual"/>
         </w:rPr>
       </w:pPr>
-      <w:hyperlink w:anchor="_Toc231803096" w:history="1">
+      <w:hyperlink w:anchor="_Toc231814619" w:history="1">
         <w:r>
           <w:rPr>
             <w:rStyle w:val="Hyperlink"/>
@@ -4207,7 +4195,7 @@
           <w:rPr>
             <w:webHidden/>
           </w:rPr>
-          <w:instrText xml:space="preserve"> PAGEREF _Toc231803096 \h </w:instrText>
+          <w:instrText xml:space="preserve"> PAGEREF _Toc231814619 \h </w:instrText>
         </w:r>
         <w:r>
           <w:rPr>
@@ -4249,7 +4237,7 @@
           <w14:ligatures w14:val="standardContextual"/>
         </w:rPr>
       </w:pPr>
-      <w:hyperlink w:anchor="_Toc231803097" w:history="1">
+      <w:hyperlink w:anchor="_Toc231814620" w:history="1">
         <w:r>
           <w:rPr>
             <w:rStyle w:val="Hyperlink"/>
@@ -4272,7 +4260,7 @@
           <w:rPr>
             <w:webHidden/>
           </w:rPr>
-          <w:instrText xml:space="preserve"> PAGEREF _Toc231803097 \h </w:instrText>
+          <w:instrText xml:space="preserve"> PAGEREF _Toc231814620 \h </w:instrText>
         </w:r>
         <w:r>
           <w:rPr>
@@ -4314,7 +4302,7 @@
           <w14:ligatures w14:val="standardContextual"/>
         </w:rPr>
       </w:pPr>
-      <w:hyperlink w:anchor="_Toc231803098" w:history="1">
+      <w:hyperlink w:anchor="_Toc231814621" w:history="1">
         <w:r>
           <w:rPr>
             <w:rStyle w:val="Hyperlink"/>
@@ -4350,7 +4338,7 @@
           <w:rPr>
             <w:webHidden/>
           </w:rPr>
-          <w:instrText xml:space="preserve"> PAGEREF _Toc231803098 \h </w:instrText>
+          <w:instrText xml:space="preserve"> PAGEREF _Toc231814621 \h </w:instrText>
         </w:r>
         <w:r>
           <w:rPr>
@@ -4392,7 +4380,7 @@
           <w14:ligatures w14:val="standardContextual"/>
         </w:rPr>
       </w:pPr>
-      <w:hyperlink w:anchor="_Toc231803099" w:history="1">
+      <w:hyperlink w:anchor="_Toc231814622" w:history="1">
         <w:r>
           <w:rPr>
             <w:rStyle w:val="Hyperlink"/>
@@ -4415,7 +4403,7 @@
           <w:rPr>
             <w:webHidden/>
           </w:rPr>
-          <w:instrText xml:space="preserve"> PAGEREF _Toc231803099 \h </w:instrText>
+          <w:instrText xml:space="preserve"> PAGEREF _Toc231814622 \h </w:instrText>
         </w:r>
         <w:r>
           <w:rPr>
@@ -4457,7 +4445,7 @@
           <w14:ligatures w14:val="standardContextual"/>
         </w:rPr>
       </w:pPr>
-      <w:hyperlink w:anchor="_Toc231803100" w:history="1">
+      <w:hyperlink w:anchor="_Toc231814623" w:history="1">
         <w:r>
           <w:rPr>
             <w:rStyle w:val="Hyperlink"/>
@@ -4480,7 +4468,7 @@
           <w:rPr>
             <w:webHidden/>
           </w:rPr>
-          <w:instrText xml:space="preserve"> PAGEREF _Toc231803100 \h </w:instrText>
+          <w:instrText xml:space="preserve"> PAGEREF _Toc231814623 \h </w:instrText>
         </w:r>
         <w:r>
           <w:rPr>
@@ -4522,7 +4510,7 @@
           <w14:ligatures w14:val="standardContextual"/>
         </w:rPr>
       </w:pPr>
-      <w:hyperlink w:anchor="_Toc231803101" w:history="1">
+      <w:hyperlink w:anchor="_Toc231814624" w:history="1">
         <w:r>
           <w:rPr>
             <w:rStyle w:val="Hyperlink"/>
@@ -4545,7 +4533,7 @@
           <w:rPr>
             <w:webHidden/>
           </w:rPr>
-          <w:instrText xml:space="preserve"> PAGEREF _Toc231803101 \h </w:instrText>
+          <w:instrText xml:space="preserve"> PAGEREF _Toc231814624 \h </w:instrText>
         </w:r>
         <w:r>
           <w:rPr>
@@ -4587,7 +4575,7 @@
           <w14:ligatures w14:val="standardContextual"/>
         </w:rPr>
       </w:pPr>
-      <w:hyperlink w:anchor="_Toc231803102" w:history="1">
+      <w:hyperlink w:anchor="_Toc231814625" w:history="1">
         <w:r>
           <w:rPr>
             <w:rStyle w:val="Hyperlink"/>
@@ -4610,7 +4598,7 @@
           <w:rPr>
             <w:webHidden/>
           </w:rPr>
-          <w:instrText xml:space="preserve"> PAGEREF _Toc231803102 \h </w:instrText>
+          <w:instrText xml:space="preserve"> PAGEREF _Toc231814625 \h </w:instrText>
         </w:r>
         <w:r>
           <w:rPr>
@@ -4652,7 +4640,7 @@
           <w14:ligatures w14:val="standardContextual"/>
         </w:rPr>
       </w:pPr>
-      <w:hyperlink w:anchor="_Toc231803103" w:history="1">
+      <w:hyperlink w:anchor="_Toc231814626" w:history="1">
         <w:r>
           <w:rPr>
             <w:rStyle w:val="Hyperlink"/>
@@ -4675,7 +4663,7 @@
           <w:rPr>
             <w:webHidden/>
           </w:rPr>
-          <w:instrText xml:space="preserve"> PAGEREF _Toc231803103 \h </w:instrText>
+          <w:instrText xml:space="preserve"> PAGEREF _Toc231814626 \h </w:instrText>
         </w:r>
         <w:r>
           <w:rPr>
@@ -4717,7 +4705,7 @@
           <w14:ligatures w14:val="standardContextual"/>
         </w:rPr>
       </w:pPr>
-      <w:hyperlink w:anchor="_Toc231803104" w:history="1">
+      <w:hyperlink w:anchor="_Toc231814627" w:history="1">
         <w:r>
           <w:rPr>
             <w:rStyle w:val="Hyperlink"/>
@@ -4740,7 +4728,7 @@
           <w:rPr>
             <w:webHidden/>
           </w:rPr>
-          <w:instrText xml:space="preserve"> PAGEREF _Toc231803104 \h </w:instrText>
+          <w:instrText xml:space="preserve"> PAGEREF _Toc231814627 \h </w:instrText>
         </w:r>
         <w:r>
           <w:rPr>
@@ -4782,7 +4770,7 @@
           <w14:ligatures w14:val="standardContextual"/>
         </w:rPr>
       </w:pPr>
-      <w:hyperlink w:anchor="_Toc231803105" w:history="1">
+      <w:hyperlink w:anchor="_Toc231814628" w:history="1">
         <w:r>
           <w:rPr>
             <w:rStyle w:val="Hyperlink"/>
@@ -4805,7 +4793,7 @@
           <w:rPr>
             <w:webHidden/>
           </w:rPr>
-          <w:instrText xml:space="preserve"> PAGEREF _Toc231803105 \h </w:instrText>
+          <w:instrText xml:space="preserve"> PAGEREF _Toc231814628 \h </w:instrText>
         </w:r>
         <w:r>
           <w:rPr>
@@ -4847,7 +4835,7 @@
           <w14:ligatures w14:val="standardContextual"/>
         </w:rPr>
       </w:pPr>
-      <w:hyperlink w:anchor="_Toc231803106" w:history="1">
+      <w:hyperlink w:anchor="_Toc231814629" w:history="1">
         <w:r>
           <w:rPr>
             <w:rStyle w:val="Hyperlink"/>
@@ -4870,7 +4858,7 @@
           <w:rPr>
             <w:webHidden/>
           </w:rPr>
-          <w:instrText xml:space="preserve"> PAGEREF _Toc231803106 \h </w:instrText>
+          <w:instrText xml:space="preserve"> PAGEREF _Toc231814629 \h </w:instrText>
         </w:r>
         <w:r>
           <w:rPr>
@@ -4912,7 +4900,7 @@
           <w14:ligatures w14:val="standardContextual"/>
         </w:rPr>
       </w:pPr>
-      <w:hyperlink w:anchor="_Toc231803107" w:history="1">
+      <w:hyperlink w:anchor="_Toc231814630" w:history="1">
         <w:r>
           <w:rPr>
             <w:rStyle w:val="Hyperlink"/>
@@ -4935,7 +4923,7 @@
           <w:rPr>
             <w:webHidden/>
           </w:rPr>
-          <w:instrText xml:space="preserve"> PAGEREF _Toc231803107 \h </w:instrText>
+          <w:instrText xml:space="preserve"> PAGEREF _Toc231814630 \h </w:instrText>
         </w:r>
         <w:r>
           <w:rPr>
@@ -4977,7 +4965,7 @@
           <w14:ligatures w14:val="standardContextual"/>
         </w:rPr>
       </w:pPr>
-      <w:hyperlink w:anchor="_Toc231803108" w:history="1">
+      <w:hyperlink w:anchor="_Toc231814631" w:history="1">
         <w:r>
           <w:rPr>
             <w:rStyle w:val="Hyperlink"/>
@@ -5001,7 +4989,7 @@
           <w:rPr>
             <w:webHidden/>
           </w:rPr>
-          <w:instrText xml:space="preserve"> PAGEREF _Toc231803108 \h </w:instrText>
+          <w:instrText xml:space="preserve"> PAGEREF _Toc231814631 \h </w:instrText>
         </w:r>
         <w:r>
           <w:rPr>
@@ -5043,7 +5031,7 @@
           <w14:ligatures w14:val="standardContextual"/>
         </w:rPr>
       </w:pPr>
-      <w:hyperlink w:anchor="_Toc231803109" w:history="1">
+      <w:hyperlink w:anchor="_Toc231814632" w:history="1">
         <w:r>
           <w:rPr>
             <w:rStyle w:val="Hyperlink"/>
@@ -5067,7 +5055,7 @@
           <w:rPr>
             <w:webHidden/>
           </w:rPr>
-          <w:instrText xml:space="preserve"> PAGEREF _Toc231803109 \h </w:instrText>
+          <w:instrText xml:space="preserve"> PAGEREF _Toc231814632 \h </w:instrText>
         </w:r>
         <w:r>
           <w:rPr>
@@ -5109,7 +5097,7 @@
           <w14:ligatures w14:val="standardContextual"/>
         </w:rPr>
       </w:pPr>
-      <w:hyperlink w:anchor="_Toc231803110" w:history="1">
+      <w:hyperlink w:anchor="_Toc231814633" w:history="1">
         <w:r>
           <w:rPr>
             <w:rStyle w:val="Hyperlink"/>
@@ -5133,7 +5121,7 @@
           <w:rPr>
             <w:webHidden/>
           </w:rPr>
-          <w:instrText xml:space="preserve"> PAGEREF _Toc231803110 \h </w:instrText>
+          <w:instrText xml:space="preserve"> PAGEREF _Toc231814633 \h </w:instrText>
         </w:r>
         <w:r>
           <w:rPr>
@@ -5175,7 +5163,7 @@
           <w14:ligatures w14:val="standardContextual"/>
         </w:rPr>
       </w:pPr>
-      <w:hyperlink w:anchor="_Toc231803111" w:history="1">
+      <w:hyperlink w:anchor="_Toc231814634" w:history="1">
         <w:r>
           <w:rPr>
             <w:rStyle w:val="Hyperlink"/>
@@ -5199,7 +5187,7 @@
           <w:rPr>
             <w:webHidden/>
           </w:rPr>
-          <w:instrText xml:space="preserve"> PAGEREF _Toc231803111 \h </w:instrText>
+          <w:instrText xml:space="preserve"> PAGEREF _Toc231814634 \h </w:instrText>
         </w:r>
         <w:r>
           <w:rPr>
@@ -5241,7 +5229,7 @@
           <w14:ligatures w14:val="standardContextual"/>
         </w:rPr>
       </w:pPr>
-      <w:hyperlink w:anchor="_Toc231803112" w:history="1">
+      <w:hyperlink w:anchor="_Toc231814635" w:history="1">
         <w:r>
           <w:rPr>
             <w:rStyle w:val="Hyperlink"/>
@@ -5264,7 +5252,7 @@
           <w:rPr>
             <w:webHidden/>
           </w:rPr>
-          <w:instrText xml:space="preserve"> PAGEREF _Toc231803112 \h </w:instrText>
+          <w:instrText xml:space="preserve"> PAGEREF _Toc231814635 \h </w:instrText>
         </w:r>
         <w:r>
           <w:rPr>
@@ -5306,7 +5294,7 @@
           <w14:ligatures w14:val="standardContextual"/>
         </w:rPr>
       </w:pPr>
-      <w:hyperlink w:anchor="_Toc231803113" w:history="1">
+      <w:hyperlink w:anchor="_Toc231814636" w:history="1">
         <w:r>
           <w:rPr>
             <w:rStyle w:val="Hyperlink"/>
@@ -5329,7 +5317,7 @@
           <w:rPr>
             <w:webHidden/>
           </w:rPr>
-          <w:instrText xml:space="preserve"> PAGEREF _Toc231803113 \h </w:instrText>
+          <w:instrText xml:space="preserve"> PAGEREF _Toc231814636 \h </w:instrText>
         </w:r>
         <w:r>
           <w:rPr>
@@ -5371,7 +5359,7 @@
           <w14:ligatures w14:val="standardContextual"/>
         </w:rPr>
       </w:pPr>
-      <w:hyperlink w:anchor="_Toc231803114" w:history="1">
+      <w:hyperlink w:anchor="_Toc231814637" w:history="1">
         <w:r>
           <w:rPr>
             <w:rStyle w:val="Hyperlink"/>
@@ -5394,7 +5382,7 @@
           <w:rPr>
             <w:webHidden/>
           </w:rPr>
-          <w:instrText xml:space="preserve"> PAGEREF _Toc231803114 \h </w:instrText>
+          <w:instrText xml:space="preserve"> PAGEREF _Toc231814637 \h </w:instrText>
         </w:r>
         <w:r>
           <w:rPr>
@@ -5436,7 +5424,7 @@
           <w14:ligatures w14:val="standardContextual"/>
         </w:rPr>
       </w:pPr>
-      <w:hyperlink w:anchor="_Toc231803115" w:history="1">
+      <w:hyperlink w:anchor="_Toc231814638" w:history="1">
         <w:r>
           <w:rPr>
             <w:rStyle w:val="Hyperlink"/>
@@ -5459,7 +5447,7 @@
           <w:rPr>
             <w:webHidden/>
           </w:rPr>
-          <w:instrText xml:space="preserve"> PAGEREF _Toc231803115 \h </w:instrText>
+          <w:instrText xml:space="preserve"> PAGEREF _Toc231814638 \h </w:instrText>
         </w:r>
         <w:r>
           <w:rPr>
@@ -5501,7 +5489,7 @@
           <w14:ligatures w14:val="standardContextual"/>
         </w:rPr>
       </w:pPr>
-      <w:hyperlink w:anchor="_Toc231803116" w:history="1">
+      <w:hyperlink w:anchor="_Toc231814639" w:history="1">
         <w:r>
           <w:rPr>
             <w:rStyle w:val="Hyperlink"/>
@@ -5524,7 +5512,7 @@
           <w:rPr>
             <w:webHidden/>
           </w:rPr>
-          <w:instrText xml:space="preserve"> PAGEREF _Toc231803116 \h </w:instrText>
+          <w:instrText xml:space="preserve"> PAGEREF _Toc231814639 \h </w:instrText>
         </w:r>
         <w:r>
           <w:rPr>
@@ -5566,7 +5554,7 @@
           <w14:ligatures w14:val="standardContextual"/>
         </w:rPr>
       </w:pPr>
-      <w:hyperlink w:anchor="_Toc231803117" w:history="1">
+      <w:hyperlink w:anchor="_Toc231814640" w:history="1">
         <w:r>
           <w:rPr>
             <w:rStyle w:val="Hyperlink"/>
@@ -5589,7 +5577,7 @@
           <w:rPr>
             <w:webHidden/>
           </w:rPr>
-          <w:instrText xml:space="preserve"> PAGEREF _Toc231803117 \h </w:instrText>
+          <w:instrText xml:space="preserve"> PAGEREF _Toc231814640 \h </w:instrText>
         </w:r>
         <w:r>
           <w:rPr>
@@ -5631,7 +5619,7 @@
           <w14:ligatures w14:val="standardContextual"/>
         </w:rPr>
       </w:pPr>
-      <w:hyperlink w:anchor="_Toc231803118" w:history="1">
+      <w:hyperlink w:anchor="_Toc231814641" w:history="1">
         <w:r>
           <w:rPr>
             <w:rStyle w:val="Hyperlink"/>
@@ -5654,7 +5642,7 @@
           <w:rPr>
             <w:webHidden/>
           </w:rPr>
-          <w:instrText xml:space="preserve"> PAGEREF _Toc231803118 \h </w:instrText>
+          <w:instrText xml:space="preserve"> PAGEREF _Toc231814641 \h </w:instrText>
         </w:r>
         <w:r>
           <w:rPr>
@@ -5696,7 +5684,7 @@
           <w14:ligatures w14:val="standardContextual"/>
         </w:rPr>
       </w:pPr>
-      <w:hyperlink w:anchor="_Toc231803119" w:history="1">
+      <w:hyperlink w:anchor="_Toc231814642" w:history="1">
         <w:r>
           <w:rPr>
             <w:rStyle w:val="Hyperlink"/>
@@ -5720,7 +5708,7 @@
           <w:rPr>
             <w:webHidden/>
           </w:rPr>
-          <w:instrText xml:space="preserve"> PAGEREF _Toc231803119 \h </w:instrText>
+          <w:instrText xml:space="preserve"> PAGEREF _Toc231814642 \h </w:instrText>
         </w:r>
         <w:r>
           <w:rPr>
@@ -5762,7 +5750,7 @@
           <w14:ligatures w14:val="standardContextual"/>
         </w:rPr>
       </w:pPr>
-      <w:hyperlink w:anchor="_Toc231803120" w:history="1">
+      <w:hyperlink w:anchor="_Toc231814643" w:history="1">
         <w:r>
           <w:rPr>
             <w:rStyle w:val="Hyperlink"/>
@@ -5785,7 +5773,7 @@
           <w:rPr>
             <w:webHidden/>
           </w:rPr>
-          <w:instrText xml:space="preserve"> PAGEREF _Toc231803120 \h </w:instrText>
+          <w:instrText xml:space="preserve"> PAGEREF _Toc231814643 \h </w:instrText>
         </w:r>
         <w:r>
           <w:rPr>
@@ -5827,7 +5815,7 @@
           <w14:ligatures w14:val="standardContextual"/>
         </w:rPr>
       </w:pPr>
-      <w:hyperlink w:anchor="_Toc231803121" w:history="1">
+      <w:hyperlink w:anchor="_Toc231814644" w:history="1">
         <w:r>
           <w:rPr>
             <w:rStyle w:val="Hyperlink"/>
@@ -5851,7 +5839,7 @@
           <w:rPr>
             <w:webHidden/>
           </w:rPr>
-          <w:instrText xml:space="preserve"> PAGEREF _Toc231803121 \h </w:instrText>
+          <w:instrText xml:space="preserve"> PAGEREF _Toc231814644 \h </w:instrText>
         </w:r>
         <w:r>
           <w:rPr>
@@ -5893,7 +5881,7 @@
           <w14:ligatures w14:val="standardContextual"/>
         </w:rPr>
       </w:pPr>
-      <w:hyperlink w:anchor="_Toc231803122" w:history="1">
+      <w:hyperlink w:anchor="_Toc231814645" w:history="1">
         <w:r>
           <w:rPr>
             <w:rStyle w:val="Hyperlink"/>
@@ -5917,7 +5905,7 @@
           <w:rPr>
             <w:webHidden/>
           </w:rPr>
-          <w:instrText xml:space="preserve"> PAGEREF _Toc231803122 \h </w:instrText>
+          <w:instrText xml:space="preserve"> PAGEREF _Toc231814645 \h </w:instrText>
         </w:r>
         <w:r>
           <w:rPr>
@@ -5959,7 +5947,7 @@
           <w14:ligatures w14:val="standardContextual"/>
         </w:rPr>
       </w:pPr>
-      <w:hyperlink w:anchor="_Toc231803123" w:history="1">
+      <w:hyperlink w:anchor="_Toc231814646" w:history="1">
         <w:r>
           <w:rPr>
             <w:rStyle w:val="Hyperlink"/>
@@ -5982,7 +5970,7 @@
           <w:rPr>
             <w:webHidden/>
           </w:rPr>
-          <w:instrText xml:space="preserve"> PAGEREF _Toc231803123 \h </w:instrText>
+          <w:instrText xml:space="preserve"> PAGEREF _Toc231814646 \h </w:instrText>
         </w:r>
         <w:r>
           <w:rPr>
@@ -6024,7 +6012,7 @@
           <w14:ligatures w14:val="standardContextual"/>
         </w:rPr>
       </w:pPr>
-      <w:hyperlink w:anchor="_Toc231803124" w:history="1">
+      <w:hyperlink w:anchor="_Toc231814647" w:history="1">
         <w:r>
           <w:rPr>
             <w:rStyle w:val="Hyperlink"/>
@@ -6047,7 +6035,7 @@
           <w:rPr>
             <w:webHidden/>
           </w:rPr>
-          <w:instrText xml:space="preserve"> PAGEREF _Toc231803124 \h </w:instrText>
+          <w:instrText xml:space="preserve"> PAGEREF _Toc231814647 \h </w:instrText>
         </w:r>
         <w:r>
           <w:rPr>
@@ -6089,7 +6077,7 @@
           <w14:ligatures w14:val="standardContextual"/>
         </w:rPr>
       </w:pPr>
-      <w:hyperlink w:anchor="_Toc231803125" w:history="1">
+      <w:hyperlink w:anchor="_Toc231814648" w:history="1">
         <w:r>
           <w:rPr>
             <w:rStyle w:val="Hyperlink"/>
@@ -6112,7 +6100,7 @@
           <w:rPr>
             <w:webHidden/>
           </w:rPr>
-          <w:instrText xml:space="preserve"> PAGEREF _Toc231803125 \h </w:instrText>
+          <w:instrText xml:space="preserve"> PAGEREF _Toc231814648 \h </w:instrText>
         </w:r>
         <w:r>
           <w:rPr>
@@ -6154,7 +6142,7 @@
           <w14:ligatures w14:val="standardContextual"/>
         </w:rPr>
       </w:pPr>
-      <w:hyperlink w:anchor="_Toc231803126" w:history="1">
+      <w:hyperlink w:anchor="_Toc231814649" w:history="1">
         <w:r>
           <w:rPr>
             <w:rStyle w:val="Hyperlink"/>
@@ -6177,7 +6165,7 @@
           <w:rPr>
             <w:webHidden/>
           </w:rPr>
-          <w:instrText xml:space="preserve"> PAGEREF _Toc231803126 \h </w:instrText>
+          <w:instrText xml:space="preserve"> PAGEREF _Toc231814649 \h </w:instrText>
         </w:r>
         <w:r>
           <w:rPr>
@@ -6219,7 +6207,7 @@
           <w14:ligatures w14:val="standardContextual"/>
         </w:rPr>
       </w:pPr>
-      <w:hyperlink w:anchor="_Toc231803127" w:history="1">
+      <w:hyperlink w:anchor="_Toc231814650" w:history="1">
         <w:r>
           <w:rPr>
             <w:rStyle w:val="Hyperlink"/>
@@ -6242,7 +6230,7 @@
           <w:rPr>
             <w:webHidden/>
           </w:rPr>
-          <w:instrText xml:space="preserve"> PAGEREF _Toc231803127 \h </w:instrText>
+          <w:instrText xml:space="preserve"> PAGEREF _Toc231814650 \h </w:instrText>
         </w:r>
         <w:r>
           <w:rPr>
@@ -6284,7 +6272,7 @@
           <w14:ligatures w14:val="standardContextual"/>
         </w:rPr>
       </w:pPr>
-      <w:hyperlink w:anchor="_Toc231803128" w:history="1">
+      <w:hyperlink w:anchor="_Toc231814651" w:history="1">
         <w:r>
           <w:rPr>
             <w:rStyle w:val="Hyperlink"/>
@@ -6307,7 +6295,7 @@
           <w:rPr>
             <w:webHidden/>
           </w:rPr>
-          <w:instrText xml:space="preserve"> PAGEREF _Toc231803128 \h </w:instrText>
+          <w:instrText xml:space="preserve"> PAGEREF _Toc231814651 \h </w:instrText>
         </w:r>
         <w:r>
           <w:rPr>
@@ -6349,7 +6337,7 @@
           <w14:ligatures w14:val="standardContextual"/>
         </w:rPr>
       </w:pPr>
-      <w:hyperlink w:anchor="_Toc231803129" w:history="1">
+      <w:hyperlink w:anchor="_Toc231814652" w:history="1">
         <w:r>
           <w:rPr>
             <w:rStyle w:val="Hyperlink"/>
@@ -6372,7 +6360,7 @@
           <w:rPr>
             <w:webHidden/>
           </w:rPr>
-          <w:instrText xml:space="preserve"> PAGEREF _Toc231803129 \h </w:instrText>
+          <w:instrText xml:space="preserve"> PAGEREF _Toc231814652 \h </w:instrText>
         </w:r>
         <w:r>
           <w:rPr>
@@ -6414,7 +6402,7 @@
           <w14:ligatures w14:val="standardContextual"/>
         </w:rPr>
       </w:pPr>
-      <w:hyperlink w:anchor="_Toc231803130" w:history="1">
+      <w:hyperlink w:anchor="_Toc231814653" w:history="1">
         <w:r>
           <w:rPr>
             <w:rStyle w:val="Hyperlink"/>
@@ -6437,7 +6425,7 @@
           <w:rPr>
             <w:webHidden/>
           </w:rPr>
-          <w:instrText xml:space="preserve"> PAGEREF _Toc231803130 \h </w:instrText>
+          <w:instrText xml:space="preserve"> PAGEREF _Toc231814653 \h </w:instrText>
         </w:r>
         <w:r>
           <w:rPr>
@@ -6479,7 +6467,7 @@
           <w14:ligatures w14:val="standardContextual"/>
         </w:rPr>
       </w:pPr>
-      <w:hyperlink w:anchor="_Toc231803131" w:history="1">
+      <w:hyperlink w:anchor="_Toc231814654" w:history="1">
         <w:r>
           <w:rPr>
             <w:rStyle w:val="Hyperlink"/>
@@ -6502,7 +6490,7 @@
           <w:rPr>
             <w:webHidden/>
           </w:rPr>
-          <w:instrText xml:space="preserve"> PAGEREF _Toc231803131 \h </w:instrText>
+          <w:instrText xml:space="preserve"> PAGEREF _Toc231814654 \h </w:instrText>
         </w:r>
         <w:r>
           <w:rPr>
@@ -6544,7 +6532,7 @@
           <w14:ligatures w14:val="standardContextual"/>
         </w:rPr>
       </w:pPr>
-      <w:hyperlink w:anchor="_Toc231803132" w:history="1">
+      <w:hyperlink w:anchor="_Toc231814655" w:history="1">
         <w:r>
           <w:rPr>
             <w:rStyle w:val="Hyperlink"/>
@@ -6567,7 +6555,7 @@
           <w:rPr>
             <w:webHidden/>
           </w:rPr>
-          <w:instrText xml:space="preserve"> PAGEREF _Toc231803132 \h </w:instrText>
+          <w:instrText xml:space="preserve"> PAGEREF _Toc231814655 \h </w:instrText>
         </w:r>
         <w:r>
           <w:rPr>
@@ -6609,7 +6597,7 @@
           <w14:ligatures w14:val="standardContextual"/>
         </w:rPr>
       </w:pPr>
-      <w:hyperlink w:anchor="_Toc231803133" w:history="1">
+      <w:hyperlink w:anchor="_Toc231814656" w:history="1">
         <w:r>
           <w:rPr>
             <w:rStyle w:val="Hyperlink"/>
@@ -6632,7 +6620,7 @@
           <w:rPr>
             <w:webHidden/>
           </w:rPr>
-          <w:instrText xml:space="preserve"> PAGEREF _Toc231803133 \h </w:instrText>
+          <w:instrText xml:space="preserve"> PAGEREF _Toc231814656 \h </w:instrText>
         </w:r>
         <w:r>
           <w:rPr>
@@ -6674,7 +6662,7 @@
           <w14:ligatures w14:val="standardContextual"/>
         </w:rPr>
       </w:pPr>
-      <w:hyperlink w:anchor="_Toc231803134" w:history="1">
+      <w:hyperlink w:anchor="_Toc231814657" w:history="1">
         <w:r>
           <w:rPr>
             <w:rStyle w:val="Hyperlink"/>
@@ -6697,7 +6685,7 @@
           <w:rPr>
             <w:webHidden/>
           </w:rPr>
-          <w:instrText xml:space="preserve"> PAGEREF _Toc231803134 \h </w:instrText>
+          <w:instrText xml:space="preserve"> PAGEREF _Toc231814657 \h </w:instrText>
         </w:r>
         <w:r>
           <w:rPr>
@@ -6739,7 +6727,7 @@
           <w14:ligatures w14:val="standardContextual"/>
         </w:rPr>
       </w:pPr>
-      <w:hyperlink w:anchor="_Toc231803135" w:history="1">
+      <w:hyperlink w:anchor="_Toc231814658" w:history="1">
         <w:r>
           <w:rPr>
             <w:rStyle w:val="Hyperlink"/>
@@ -6762,7 +6750,7 @@
           <w:rPr>
             <w:webHidden/>
           </w:rPr>
-          <w:instrText xml:space="preserve"> PAGEREF _Toc231803135 \h </w:instrText>
+          <w:instrText xml:space="preserve"> PAGEREF _Toc231814658 \h </w:instrText>
         </w:r>
         <w:r>
           <w:rPr>
@@ -6804,7 +6792,7 @@
           <w14:ligatures w14:val="standardContextual"/>
         </w:rPr>
       </w:pPr>
-      <w:hyperlink w:anchor="_Toc231803136" w:history="1">
+      <w:hyperlink w:anchor="_Toc231814659" w:history="1">
         <w:r>
           <w:rPr>
             <w:rStyle w:val="Hyperlink"/>
@@ -6827,7 +6815,7 @@
           <w:rPr>
             <w:webHidden/>
           </w:rPr>
-          <w:instrText xml:space="preserve"> PAGEREF _Toc231803136 \h </w:instrText>
+          <w:instrText xml:space="preserve"> PAGEREF _Toc231814659 \h </w:instrText>
         </w:r>
         <w:r>
           <w:rPr>
@@ -6869,7 +6857,7 @@
           <w14:ligatures w14:val="standardContextual"/>
         </w:rPr>
       </w:pPr>
-      <w:hyperlink w:anchor="_Toc231803137" w:history="1">
+      <w:hyperlink w:anchor="_Toc231814660" w:history="1">
         <w:r>
           <w:rPr>
             <w:rStyle w:val="Hyperlink"/>
@@ -6892,7 +6880,7 @@
           <w:rPr>
             <w:webHidden/>
           </w:rPr>
-          <w:instrText xml:space="preserve"> PAGEREF _Toc231803137 \h </w:instrText>
+          <w:instrText xml:space="preserve"> PAGEREF _Toc231814660 \h </w:instrText>
         </w:r>
         <w:r>
           <w:rPr>
@@ -6934,7 +6922,7 @@
           <w14:ligatures w14:val="standardContextual"/>
         </w:rPr>
       </w:pPr>
-      <w:hyperlink w:anchor="_Toc231803138" w:history="1">
+      <w:hyperlink w:anchor="_Toc231814661" w:history="1">
         <w:r>
           <w:rPr>
             <w:rStyle w:val="Hyperlink"/>
@@ -6957,7 +6945,7 @@
           <w:rPr>
             <w:webHidden/>
           </w:rPr>
-          <w:instrText xml:space="preserve"> PAGEREF _Toc231803138 \h </w:instrText>
+          <w:instrText xml:space="preserve"> PAGEREF _Toc231814661 \h </w:instrText>
         </w:r>
         <w:r>
           <w:rPr>
@@ -6999,7 +6987,7 @@
           <w14:ligatures w14:val="standardContextual"/>
         </w:rPr>
       </w:pPr>
-      <w:hyperlink w:anchor="_Toc231803139" w:history="1">
+      <w:hyperlink w:anchor="_Toc231814662" w:history="1">
         <w:r>
           <w:rPr>
             <w:rStyle w:val="Hyperlink"/>
@@ -7022,7 +7010,7 @@
           <w:rPr>
             <w:webHidden/>
           </w:rPr>
-          <w:instrText xml:space="preserve"> PAGEREF _Toc231803139 \h </w:instrText>
+          <w:instrText xml:space="preserve"> PAGEREF _Toc231814662 \h </w:instrText>
         </w:r>
         <w:r>
           <w:rPr>
@@ -7064,7 +7052,7 @@
           <w14:ligatures w14:val="standardContextual"/>
         </w:rPr>
       </w:pPr>
-      <w:hyperlink w:anchor="_Toc231803140" w:history="1">
+      <w:hyperlink w:anchor="_Toc231814663" w:history="1">
         <w:r>
           <w:rPr>
             <w:rStyle w:val="Hyperlink"/>
@@ -7087,7 +7075,7 @@
           <w:rPr>
             <w:webHidden/>
           </w:rPr>
-          <w:instrText xml:space="preserve"> PAGEREF _Toc231803140 \h </w:instrText>
+          <w:instrText xml:space="preserve"> PAGEREF _Toc231814663 \h </w:instrText>
         </w:r>
         <w:r>
           <w:rPr>
@@ -7129,7 +7117,7 @@
           <w14:ligatures w14:val="standardContextual"/>
         </w:rPr>
       </w:pPr>
-      <w:hyperlink w:anchor="_Toc231803141" w:history="1">
+      <w:hyperlink w:anchor="_Toc231814664" w:history="1">
         <w:r>
           <w:rPr>
             <w:rStyle w:val="Hyperlink"/>
@@ -7152,7 +7140,7 @@
           <w:rPr>
             <w:webHidden/>
           </w:rPr>
-          <w:instrText xml:space="preserve"> PAGEREF _Toc231803141 \h </w:instrText>
+          <w:instrText xml:space="preserve"> PAGEREF _Toc231814664 \h </w:instrText>
         </w:r>
         <w:r>
           <w:rPr>
@@ -7194,7 +7182,7 @@
           <w14:ligatures w14:val="standardContextual"/>
         </w:rPr>
       </w:pPr>
-      <w:hyperlink w:anchor="_Toc231803142" w:history="1">
+      <w:hyperlink w:anchor="_Toc231814665" w:history="1">
         <w:r>
           <w:rPr>
             <w:rStyle w:val="Hyperlink"/>
@@ -7217,7 +7205,7 @@
           <w:rPr>
             <w:webHidden/>
           </w:rPr>
-          <w:instrText xml:space="preserve"> PAGEREF _Toc231803142 \h </w:instrText>
+          <w:instrText xml:space="preserve"> PAGEREF _Toc231814665 \h </w:instrText>
         </w:r>
         <w:r>
           <w:rPr>
@@ -7259,7 +7247,7 @@
           <w14:ligatures w14:val="standardContextual"/>
         </w:rPr>
       </w:pPr>
-      <w:hyperlink w:anchor="_Toc231803143" w:history="1">
+      <w:hyperlink w:anchor="_Toc231814666" w:history="1">
         <w:r>
           <w:rPr>
             <w:rStyle w:val="Hyperlink"/>
@@ -7282,7 +7270,7 @@
           <w:rPr>
             <w:webHidden/>
           </w:rPr>
-          <w:instrText xml:space="preserve"> PAGEREF _Toc231803143 \h </w:instrText>
+          <w:instrText xml:space="preserve"> PAGEREF _Toc231814666 \h </w:instrText>
         </w:r>
         <w:r>
           <w:rPr>
@@ -7324,7 +7312,7 @@
           <w14:ligatures w14:val="standardContextual"/>
         </w:rPr>
       </w:pPr>
-      <w:hyperlink w:anchor="_Toc231803144" w:history="1">
+      <w:hyperlink w:anchor="_Toc231814667" w:history="1">
         <w:r>
           <w:rPr>
             <w:rStyle w:val="Hyperlink"/>
@@ -7347,7 +7335,7 @@
           <w:rPr>
             <w:webHidden/>
           </w:rPr>
-          <w:instrText xml:space="preserve"> PAGEREF _Toc231803144 \h </w:instrText>
+          <w:instrText xml:space="preserve"> PAGEREF _Toc231814667 \h </w:instrText>
         </w:r>
         <w:r>
           <w:rPr>
@@ -7420,12 +7408,12 @@
       <w:r>
         <w:fldChar w:fldCharType="separate"/>
       </w:r>
-      <w:hyperlink w:anchor="_Toc231803153" w:history="1">
+      <w:hyperlink w:anchor="_Toc231814668" w:history="1">
         <w:r>
           <w:rPr>
             <w:rStyle w:val="Hyperlink"/>
           </w:rPr>
-          <w:t>Hình 2.3: Trình duyệt hiển thị phần tử được thay thế và phần tử không được thay thế</w:t>
+          <w:t>Hình 2.3: Trình duyệt hiển thị phần tử được và phần tử không được thay thế</w:t>
         </w:r>
         <w:r>
           <w:rPr>
@@ -7443,7 +7431,7 @@
           <w:rPr>
             <w:webHidden/>
           </w:rPr>
-          <w:instrText xml:space="preserve"> PAGEREF _Toc231803153 \h </w:instrText>
+          <w:instrText xml:space="preserve"> PAGEREF _Toc231814668 \h </w:instrText>
         </w:r>
         <w:r>
           <w:rPr>
@@ -7485,7 +7473,7 @@
           <w14:ligatures w14:val="standardContextual"/>
         </w:rPr>
       </w:pPr>
-      <w:hyperlink w:anchor="_Toc231803154" w:history="1">
+      <w:hyperlink w:anchor="_Toc231814669" w:history="1">
         <w:r>
           <w:rPr>
             <w:rStyle w:val="Hyperlink"/>
@@ -7508,7 +7496,7 @@
           <w:rPr>
             <w:webHidden/>
           </w:rPr>
-          <w:instrText xml:space="preserve"> PAGEREF _Toc231803154 \h </w:instrText>
+          <w:instrText xml:space="preserve"> PAGEREF _Toc231814669 \h </w:instrText>
         </w:r>
         <w:r>
           <w:rPr>
@@ -7550,7 +7538,7 @@
           <w14:ligatures w14:val="standardContextual"/>
         </w:rPr>
       </w:pPr>
-      <w:hyperlink w:anchor="_Toc231803155" w:history="1">
+      <w:hyperlink w:anchor="_Toc231814670" w:history="1">
         <w:r>
           <w:rPr>
             <w:rStyle w:val="Hyperlink"/>
@@ -7573,7 +7561,7 @@
           <w:rPr>
             <w:webHidden/>
           </w:rPr>
-          <w:instrText xml:space="preserve"> PAGEREF _Toc231803155 \h </w:instrText>
+          <w:instrText xml:space="preserve"> PAGEREF _Toc231814670 \h </w:instrText>
         </w:r>
         <w:r>
           <w:rPr>
@@ -7615,7 +7603,7 @@
           <w14:ligatures w14:val="standardContextual"/>
         </w:rPr>
       </w:pPr>
-      <w:hyperlink w:anchor="_Toc231803156" w:history="1">
+      <w:hyperlink w:anchor="_Toc231814671" w:history="1">
         <w:r>
           <w:rPr>
             <w:rStyle w:val="Hyperlink"/>
@@ -7638,7 +7626,7 @@
           <w:rPr>
             <w:webHidden/>
           </w:rPr>
-          <w:instrText xml:space="preserve"> PAGEREF _Toc231803156 \h </w:instrText>
+          <w:instrText xml:space="preserve"> PAGEREF _Toc231814671 \h </w:instrText>
         </w:r>
         <w:r>
           <w:rPr>
@@ -7680,7 +7668,7 @@
           <w14:ligatures w14:val="standardContextual"/>
         </w:rPr>
       </w:pPr>
-      <w:hyperlink w:anchor="_Toc231803157" w:history="1">
+      <w:hyperlink w:anchor="_Toc231814672" w:history="1">
         <w:r>
           <w:rPr>
             <w:rStyle w:val="Hyperlink"/>
@@ -7703,7 +7691,7 @@
           <w:rPr>
             <w:webHidden/>
           </w:rPr>
-          <w:instrText xml:space="preserve"> PAGEREF _Toc231803157 \h </w:instrText>
+          <w:instrText xml:space="preserve"> PAGEREF _Toc231814672 \h </w:instrText>
         </w:r>
         <w:r>
           <w:rPr>
@@ -7745,7 +7733,7 @@
           <w14:ligatures w14:val="standardContextual"/>
         </w:rPr>
       </w:pPr>
-      <w:hyperlink w:anchor="_Toc231803158" w:history="1">
+      <w:hyperlink w:anchor="_Toc231814673" w:history="1">
         <w:r>
           <w:rPr>
             <w:rStyle w:val="Hyperlink"/>
@@ -7768,7 +7756,7 @@
           <w:rPr>
             <w:webHidden/>
           </w:rPr>
-          <w:instrText xml:space="preserve"> PAGEREF _Toc231803158 \h </w:instrText>
+          <w:instrText xml:space="preserve"> PAGEREF _Toc231814673 \h </w:instrText>
         </w:r>
         <w:r>
           <w:rPr>
@@ -7810,7 +7798,7 @@
           <w14:ligatures w14:val="standardContextual"/>
         </w:rPr>
       </w:pPr>
-      <w:hyperlink w:anchor="_Toc231803159" w:history="1">
+      <w:hyperlink w:anchor="_Toc231814674" w:history="1">
         <w:r>
           <w:rPr>
             <w:rStyle w:val="Hyperlink"/>
@@ -7833,7 +7821,7 @@
           <w:rPr>
             <w:webHidden/>
           </w:rPr>
-          <w:instrText xml:space="preserve"> PAGEREF _Toc231803159 \h </w:instrText>
+          <w:instrText xml:space="preserve"> PAGEREF _Toc231814674 \h </w:instrText>
         </w:r>
         <w:r>
           <w:rPr>
@@ -7875,7 +7863,7 @@
           <w14:ligatures w14:val="standardContextual"/>
         </w:rPr>
       </w:pPr>
-      <w:hyperlink w:anchor="_Toc231803160" w:history="1">
+      <w:hyperlink w:anchor="_Toc231814675" w:history="1">
         <w:r>
           <w:rPr>
             <w:rStyle w:val="Hyperlink"/>
@@ -7898,7 +7886,7 @@
           <w:rPr>
             <w:webHidden/>
           </w:rPr>
-          <w:instrText xml:space="preserve"> PAGEREF _Toc231803160 \h </w:instrText>
+          <w:instrText xml:space="preserve"> PAGEREF _Toc231814675 \h </w:instrText>
         </w:r>
         <w:r>
           <w:rPr>
@@ -7940,7 +7928,7 @@
           <w14:ligatures w14:val="standardContextual"/>
         </w:rPr>
       </w:pPr>
-      <w:hyperlink w:anchor="_Toc231803161" w:history="1">
+      <w:hyperlink w:anchor="_Toc231814676" w:history="1">
         <w:r>
           <w:rPr>
             <w:rStyle w:val="Hyperlink"/>
@@ -7963,7 +7951,7 @@
           <w:rPr>
             <w:webHidden/>
           </w:rPr>
-          <w:instrText xml:space="preserve"> PAGEREF _Toc231803161 \h </w:instrText>
+          <w:instrText xml:space="preserve"> PAGEREF _Toc231814676 \h </w:instrText>
         </w:r>
         <w:r>
           <w:rPr>
@@ -8005,7 +7993,7 @@
           <w14:ligatures w14:val="standardContextual"/>
         </w:rPr>
       </w:pPr>
-      <w:hyperlink w:anchor="_Toc231803162" w:history="1">
+      <w:hyperlink w:anchor="_Toc231814677" w:history="1">
         <w:r>
           <w:rPr>
             <w:rStyle w:val="Hyperlink"/>
@@ -8028,7 +8016,7 @@
           <w:rPr>
             <w:webHidden/>
           </w:rPr>
-          <w:instrText xml:space="preserve"> PAGEREF _Toc231803162 \h </w:instrText>
+          <w:instrText xml:space="preserve"> PAGEREF _Toc231814677 \h </w:instrText>
         </w:r>
         <w:r>
           <w:rPr>
@@ -8070,7 +8058,7 @@
           <w14:ligatures w14:val="standardContextual"/>
         </w:rPr>
       </w:pPr>
-      <w:hyperlink w:anchor="_Toc231803163" w:history="1">
+      <w:hyperlink w:anchor="_Toc231814678" w:history="1">
         <w:r>
           <w:rPr>
             <w:rStyle w:val="Hyperlink"/>
@@ -8093,7 +8081,7 @@
           <w:rPr>
             <w:webHidden/>
           </w:rPr>
-          <w:instrText xml:space="preserve"> PAGEREF _Toc231803163 \h </w:instrText>
+          <w:instrText xml:space="preserve"> PAGEREF _Toc231814678 \h </w:instrText>
         </w:r>
         <w:r>
           <w:rPr>
@@ -8110,7 +8098,7 @@
           <w:rPr>
             <w:webHidden/>
           </w:rPr>
-          <w:t>42</w:t>
+          <w:t>43</w:t>
         </w:r>
         <w:r>
           <w:rPr>
@@ -8173,7 +8161,7 @@
       <w:r>
         <w:fldChar w:fldCharType="separate"/>
       </w:r>
-      <w:hyperlink w:anchor="_Toc231803164" w:history="1">
+      <w:hyperlink w:anchor="_Toc231814679" w:history="1">
         <w:r>
           <w:rPr>
             <w:rStyle w:val="Hyperlink"/>
@@ -8196,7 +8184,7 @@
           <w:rPr>
             <w:webHidden/>
           </w:rPr>
-          <w:instrText xml:space="preserve"> PAGEREF _Toc231803164 \h </w:instrText>
+          <w:instrText xml:space="preserve"> PAGEREF _Toc231814679 \h </w:instrText>
         </w:r>
         <w:r>
           <w:rPr>
@@ -8238,7 +8226,7 @@
           <w14:ligatures w14:val="standardContextual"/>
         </w:rPr>
       </w:pPr>
-      <w:hyperlink w:anchor="_Toc231803165" w:history="1">
+      <w:hyperlink w:anchor="_Toc231814680" w:history="1">
         <w:r>
           <w:rPr>
             <w:rStyle w:val="Hyperlink"/>
@@ -8261,7 +8249,7 @@
           <w:rPr>
             <w:webHidden/>
           </w:rPr>
-          <w:instrText xml:space="preserve"> PAGEREF _Toc231803165 \h </w:instrText>
+          <w:instrText xml:space="preserve"> PAGEREF _Toc231814680 \h </w:instrText>
         </w:r>
         <w:r>
           <w:rPr>
@@ -8303,7 +8291,7 @@
           <w14:ligatures w14:val="standardContextual"/>
         </w:rPr>
       </w:pPr>
-      <w:hyperlink w:anchor="_Toc231803166" w:history="1">
+      <w:hyperlink w:anchor="_Toc231814681" w:history="1">
         <w:r>
           <w:rPr>
             <w:rStyle w:val="Hyperlink"/>
@@ -8326,7 +8314,7 @@
           <w:rPr>
             <w:webHidden/>
           </w:rPr>
-          <w:instrText xml:space="preserve"> PAGEREF _Toc231803166 \h </w:instrText>
+          <w:instrText xml:space="preserve"> PAGEREF _Toc231814681 \h </w:instrText>
         </w:r>
         <w:r>
           <w:rPr>
@@ -8368,7 +8356,7 @@
           <w14:ligatures w14:val="standardContextual"/>
         </w:rPr>
       </w:pPr>
-      <w:hyperlink w:anchor="_Toc231803167" w:history="1">
+      <w:hyperlink w:anchor="_Toc231814682" w:history="1">
         <w:r>
           <w:rPr>
             <w:rStyle w:val="Hyperlink"/>
@@ -8391,7 +8379,7 @@
           <w:rPr>
             <w:webHidden/>
           </w:rPr>
-          <w:instrText xml:space="preserve"> PAGEREF _Toc231803167 \h </w:instrText>
+          <w:instrText xml:space="preserve"> PAGEREF _Toc231814682 \h </w:instrText>
         </w:r>
         <w:r>
           <w:rPr>
@@ -8433,7 +8421,7 @@
           <w14:ligatures w14:val="standardContextual"/>
         </w:rPr>
       </w:pPr>
-      <w:hyperlink w:anchor="_Toc231803168" w:history="1">
+      <w:hyperlink w:anchor="_Toc231814683" w:history="1">
         <w:r>
           <w:rPr>
             <w:rStyle w:val="Hyperlink"/>
@@ -8456,7 +8444,7 @@
           <w:rPr>
             <w:webHidden/>
           </w:rPr>
-          <w:instrText xml:space="preserve"> PAGEREF _Toc231803168 \h </w:instrText>
+          <w:instrText xml:space="preserve"> PAGEREF _Toc231814683 \h </w:instrText>
         </w:r>
         <w:r>
           <w:rPr>
@@ -8498,7 +8486,7 @@
           <w14:ligatures w14:val="standardContextual"/>
         </w:rPr>
       </w:pPr>
-      <w:hyperlink w:anchor="_Toc231803169" w:history="1">
+      <w:hyperlink w:anchor="_Toc231814684" w:history="1">
         <w:r>
           <w:rPr>
             <w:rStyle w:val="Hyperlink"/>
@@ -8521,7 +8509,7 @@
           <w:rPr>
             <w:webHidden/>
           </w:rPr>
-          <w:instrText xml:space="preserve"> PAGEREF _Toc231803169 \h </w:instrText>
+          <w:instrText xml:space="preserve"> PAGEREF _Toc231814684 \h </w:instrText>
         </w:r>
         <w:r>
           <w:rPr>
@@ -8563,7 +8551,7 @@
           <w14:ligatures w14:val="standardContextual"/>
         </w:rPr>
       </w:pPr>
-      <w:hyperlink w:anchor="_Toc231803170" w:history="1">
+      <w:hyperlink w:anchor="_Toc231814685" w:history="1">
         <w:r>
           <w:rPr>
             <w:rStyle w:val="Hyperlink"/>
@@ -8586,7 +8574,7 @@
           <w:rPr>
             <w:webHidden/>
           </w:rPr>
-          <w:instrText xml:space="preserve"> PAGEREF _Toc231803170 \h </w:instrText>
+          <w:instrText xml:space="preserve"> PAGEREF _Toc231814685 \h </w:instrText>
         </w:r>
         <w:r>
           <w:rPr>
@@ -8628,7 +8616,7 @@
           <w14:ligatures w14:val="standardContextual"/>
         </w:rPr>
       </w:pPr>
-      <w:hyperlink w:anchor="_Toc231803171" w:history="1">
+      <w:hyperlink w:anchor="_Toc231814686" w:history="1">
         <w:r>
           <w:rPr>
             <w:rStyle w:val="Hyperlink"/>
@@ -8651,7 +8639,7 @@
           <w:rPr>
             <w:webHidden/>
           </w:rPr>
-          <w:instrText xml:space="preserve"> PAGEREF _Toc231803171 \h </w:instrText>
+          <w:instrText xml:space="preserve"> PAGEREF _Toc231814686 \h </w:instrText>
         </w:r>
         <w:r>
           <w:rPr>
@@ -8693,7 +8681,7 @@
           <w14:ligatures w14:val="standardContextual"/>
         </w:rPr>
       </w:pPr>
-      <w:hyperlink w:anchor="_Toc231803172" w:history="1">
+      <w:hyperlink w:anchor="_Toc231814687" w:history="1">
         <w:r>
           <w:rPr>
             <w:rStyle w:val="Hyperlink"/>
@@ -8716,7 +8704,7 @@
           <w:rPr>
             <w:webHidden/>
           </w:rPr>
-          <w:instrText xml:space="preserve"> PAGEREF _Toc231803172 \h </w:instrText>
+          <w:instrText xml:space="preserve"> PAGEREF _Toc231814687 \h </w:instrText>
         </w:r>
         <w:r>
           <w:rPr>
@@ -8758,7 +8746,7 @@
           <w14:ligatures w14:val="standardContextual"/>
         </w:rPr>
       </w:pPr>
-      <w:hyperlink w:anchor="_Toc231803173" w:history="1">
+      <w:hyperlink w:anchor="_Toc231814688" w:history="1">
         <w:r>
           <w:rPr>
             <w:rStyle w:val="Hyperlink"/>
@@ -8781,7 +8769,7 @@
           <w:rPr>
             <w:webHidden/>
           </w:rPr>
-          <w:instrText xml:space="preserve"> PAGEREF _Toc231803173 \h </w:instrText>
+          <w:instrText xml:space="preserve"> PAGEREF _Toc231814688 \h </w:instrText>
         </w:r>
         <w:r>
           <w:rPr>
@@ -8823,7 +8811,7 @@
           <w14:ligatures w14:val="standardContextual"/>
         </w:rPr>
       </w:pPr>
-      <w:hyperlink w:anchor="_Toc231803174" w:history="1">
+      <w:hyperlink w:anchor="_Toc231814689" w:history="1">
         <w:r>
           <w:rPr>
             <w:rStyle w:val="Hyperlink"/>
@@ -8846,7 +8834,7 @@
           <w:rPr>
             <w:webHidden/>
           </w:rPr>
-          <w:instrText xml:space="preserve"> PAGEREF _Toc231803174 \h </w:instrText>
+          <w:instrText xml:space="preserve"> PAGEREF _Toc231814689 \h </w:instrText>
         </w:r>
         <w:r>
           <w:rPr>
@@ -8918,6 +8906,9 @@
     <w:p>
       <w:pPr>
         <w:pStyle w:val="noidung"/>
+        <w:rPr>
+          <w:lang w:val="en-US"/>
+        </w:rPr>
       </w:pPr>
       <w:r>
         <w:t xml:space="preserve">CSS: </w:t>
@@ -9094,7 +9085,7 @@
       <w:pPr>
         <w:pStyle w:val="Heading1"/>
       </w:pPr>
-      <w:bookmarkStart w:id="0" w:name="_Toc231803055"/>
+      <w:bookmarkStart w:id="0" w:name="_Toc231814578"/>
       <w:r>
         <w:lastRenderedPageBreak/>
         <w:t>TỔNG QUAN NGHIÊN CỨU</w:t>
@@ -9105,7 +9096,7 @@
       <w:pPr>
         <w:pStyle w:val="Heading2"/>
       </w:pPr>
-      <w:bookmarkStart w:id="1" w:name="_Toc231803056"/>
+      <w:bookmarkStart w:id="1" w:name="_Toc231814579"/>
       <w:r>
         <w:t>Đặt vấn đề</w:t>
       </w:r>
@@ -9123,7 +9114,7 @@
       <w:pPr>
         <w:pStyle w:val="Heading2"/>
       </w:pPr>
-      <w:bookmarkStart w:id="2" w:name="_Toc231803057"/>
+      <w:bookmarkStart w:id="2" w:name="_Toc231814580"/>
       <w:r>
         <w:t>Mục tiêu nghiên cứu</w:t>
       </w:r>
@@ -9179,7 +9170,7 @@
       <w:pPr>
         <w:pStyle w:val="Heading2"/>
       </w:pPr>
-      <w:bookmarkStart w:id="3" w:name="_Toc231803058"/>
+      <w:bookmarkStart w:id="3" w:name="_Toc231814581"/>
       <w:r>
         <w:t>Phương pháp nghiên cứu</w:t>
       </w:r>
@@ -9226,7 +9217,7 @@
       <w:pPr>
         <w:pStyle w:val="Heading2"/>
       </w:pPr>
-      <w:bookmarkStart w:id="4" w:name="_Toc231803059"/>
+      <w:bookmarkStart w:id="4" w:name="_Toc231814582"/>
       <w:r>
         <w:t>Đối tượng nghiên cứu</w:t>
       </w:r>
@@ -9266,7 +9257,7 @@
       <w:pPr>
         <w:pStyle w:val="Heading1"/>
       </w:pPr>
-      <w:bookmarkStart w:id="5" w:name="_Toc231803060"/>
+      <w:bookmarkStart w:id="5" w:name="_Toc231814583"/>
       <w:r>
         <w:rPr>
           <w:caps w:val="0"/>
@@ -9280,7 +9271,7 @@
       <w:pPr>
         <w:pStyle w:val="Heading2"/>
       </w:pPr>
-      <w:bookmarkStart w:id="6" w:name="_Toc231803061"/>
+      <w:bookmarkStart w:id="6" w:name="_Toc231814584"/>
       <w:r>
         <w:t>Ngôn ngữ HTML</w:t>
       </w:r>
@@ -9290,7 +9281,7 @@
       <w:pPr>
         <w:pStyle w:val="Heading3"/>
       </w:pPr>
-      <w:bookmarkStart w:id="7" w:name="_Toc231803062"/>
+      <w:bookmarkStart w:id="7" w:name="_Toc231814585"/>
       <w:r>
         <w:t>Tổng quan về HTML</w:t>
       </w:r>
@@ -9300,7 +9291,7 @@
       <w:pPr>
         <w:pStyle w:val="Heading4"/>
       </w:pPr>
-      <w:bookmarkStart w:id="8" w:name="_Toc231803063"/>
+      <w:bookmarkStart w:id="8" w:name="_Toc231814586"/>
       <w:r>
         <w:t>Ưu và nhược điểm của HTML</w:t>
       </w:r>
@@ -9495,7 +9486,7 @@
       <w:pPr>
         <w:pStyle w:val="Heading4"/>
       </w:pPr>
-      <w:bookmarkStart w:id="9" w:name="_Toc231803064"/>
+      <w:bookmarkStart w:id="9" w:name="_Toc231814587"/>
       <w:r>
         <w:lastRenderedPageBreak/>
         <w:t>HTML là gì?</w:t>
@@ -9550,7 +9541,7 @@
       <w:pPr>
         <w:pStyle w:val="Heading3"/>
       </w:pPr>
-      <w:bookmarkStart w:id="10" w:name="_Toc231803065"/>
+      <w:bookmarkStart w:id="10" w:name="_Toc231814588"/>
       <w:r>
         <w:t>Các k</w:t>
       </w:r>
@@ -9566,7 +9557,7 @@
       <w:pPr>
         <w:pStyle w:val="Heading4"/>
       </w:pPr>
-      <w:bookmarkStart w:id="11" w:name="_Toc231803066"/>
+      <w:bookmarkStart w:id="11" w:name="_Toc231814589"/>
       <w:r>
         <w:t>Phần tử HTML và thẻ đóng</w:t>
       </w:r>
@@ -9616,7 +9607,7 @@
       <w:pPr>
         <w:pStyle w:val="Heading4"/>
       </w:pPr>
-      <w:bookmarkStart w:id="12" w:name="_Toc231803067"/>
+      <w:bookmarkStart w:id="12" w:name="_Toc231814590"/>
       <w:r>
         <w:t>Phần tử không được thay thế và phần tử được thay thế</w:t>
       </w:r>
@@ -9754,7 +9745,7 @@
       <w:pPr>
         <w:pStyle w:val="Caption"/>
       </w:pPr>
-      <w:bookmarkStart w:id="13" w:name="_Toc231803153"/>
+      <w:bookmarkStart w:id="13" w:name="_Toc231814668"/>
       <w:r>
         <w:t xml:space="preserve">Hình </w:t>
       </w:r>
@@ -9792,7 +9783,7 @@
         <w:fldChar w:fldCharType="end"/>
       </w:r>
       <w:r>
-        <w:t>: Trình duyệt hiển thị phần tử được thay thế và phần tử không được thay thế</w:t>
+        <w:t>: Trình duyệt hiển thị phần tử được và phần tử không được thay thế</w:t>
       </w:r>
       <w:bookmarkEnd w:id="13"/>
     </w:p>
@@ -9800,7 +9791,7 @@
       <w:pPr>
         <w:pStyle w:val="Heading4"/>
       </w:pPr>
-      <w:bookmarkStart w:id="14" w:name="_Toc231803068"/>
+      <w:bookmarkStart w:id="14" w:name="_Toc231814591"/>
       <w:r>
         <w:t>Phần tử trống</w:t>
       </w:r>
@@ -9845,15 +9836,18 @@
         <w:pStyle w:val="noidung"/>
       </w:pPr>
       <w:r>
+        <w:t xml:space="preserve">Hầu hết các phần tử được thay thế cũng là phần tử trống, nhưng không phải tất cả. Ví dụ: &lt;video&gt;, &lt;picture&gt;, &lt;object&gt;, &lt;iframe&gt; là phần tử được thay thế nhưng </w:t>
+      </w:r>
+      <w:r>
         <w:lastRenderedPageBreak/>
-        <w:t>Hầu hết các phần tử được thay thế cũng là phần tử trống, nhưng không phải tất cả. Ví dụ: &lt;video&gt;, &lt;picture&gt;, &lt;object&gt;, &lt;iframe&gt; là phần tử được thay thế nhưng không trống, vì chúng có thể chứa nội dung hoặc phần tử khác và cần thẻ đóng. Ngược lại, một số phần tử trống như &lt;meta&gt;, &lt;link&gt; không hiển thị trực tiếp nội dung mà chỉ cung cấp thông tin cho trình duyệt.</w:t>
+        <w:t>không trống, vì chúng có thể chứa nội dung hoặc phần tử khác và cần thẻ đóng. Ngược lại, một số phần tử trống như &lt;meta&gt;, &lt;link&gt; không hiển thị trực tiếp nội dung mà chỉ cung cấp thông tin cho trình duyệt.</w:t>
       </w:r>
     </w:p>
     <w:p>
       <w:pPr>
         <w:pStyle w:val="Heading4"/>
       </w:pPr>
-      <w:bookmarkStart w:id="15" w:name="_Toc231803069"/>
+      <w:bookmarkStart w:id="15" w:name="_Toc231814592"/>
       <w:r>
         <w:t>Thuộc tính</w:t>
       </w:r>
@@ -9864,7 +9858,7 @@
         <w:pStyle w:val="Caption"/>
         <w:keepNext/>
       </w:pPr>
-      <w:bookmarkStart w:id="16" w:name="_Toc231803164"/>
+      <w:bookmarkStart w:id="16" w:name="_Toc231814679"/>
       <w:r>
         <w:t xml:space="preserve">Bảng </w:t>
       </w:r>
@@ -10219,7 +10213,7 @@
       <w:pPr>
         <w:pStyle w:val="Heading3"/>
       </w:pPr>
-      <w:bookmarkStart w:id="17" w:name="_Toc231803070"/>
+      <w:bookmarkStart w:id="17" w:name="_Toc231814593"/>
       <w:r>
         <w:t>Một số vai trò của HTML</w:t>
       </w:r>
@@ -10286,7 +10280,6 @@
         </w:numPr>
       </w:pPr>
       <w:r>
-        <w:lastRenderedPageBreak/>
         <w:t>Giúp website dễ dàng tiếp cận người dùng trên nhiều nền tảng (PC, tablet, smartphone).</w:t>
       </w:r>
     </w:p>
@@ -10307,6 +10300,7 @@
         </w:numPr>
       </w:pPr>
       <w:r>
+        <w:lastRenderedPageBreak/>
         <w:t>Cho phép tạo liên kết giữa các trang web, hình thành nên World Wide Web.</w:t>
       </w:r>
     </w:p>
@@ -10390,7 +10384,7 @@
       <w:pPr>
         <w:pStyle w:val="Heading3"/>
       </w:pPr>
-      <w:bookmarkStart w:id="18" w:name="_Toc231803071"/>
+      <w:bookmarkStart w:id="18" w:name="_Toc231814594"/>
       <w:r>
         <w:t>Cấu trúc tài liệu HTML</w:t>
       </w:r>
@@ -10400,7 +10394,7 @@
       <w:pPr>
         <w:pStyle w:val="Heading4"/>
       </w:pPr>
-      <w:bookmarkStart w:id="19" w:name="_Toc231803072"/>
+      <w:bookmarkStart w:id="19" w:name="_Toc231814595"/>
       <w:r>
         <w:t>Cấu trúc cơ bản của một tài liệu HTML</w:t>
       </w:r>
@@ -10459,7 +10453,6 @@
         </w:numPr>
       </w:pPr>
       <w:r>
-        <w:lastRenderedPageBreak/>
         <w:t>&lt;title&gt;: Tiêu đề trang, hiển thị trên tab trình duyệt và kết quả tìm kiếm.</w:t>
       </w:r>
     </w:p>
@@ -10480,6 +10473,7 @@
         <w:pStyle w:val="noidung"/>
       </w:pPr>
       <w:r>
+        <w:lastRenderedPageBreak/>
         <w:t>&lt;body&gt;: Chứa toàn bộ nội dung hiển thị cho người dùng (văn bản, hình ảnh, video, liên kết, bảng biểu…).</w:t>
       </w:r>
     </w:p>
@@ -10490,7 +10484,7 @@
           <w:rFonts w:eastAsia="Times New Roman"/>
         </w:rPr>
       </w:pPr>
-      <w:bookmarkStart w:id="20" w:name="_Toc231803073"/>
+      <w:bookmarkStart w:id="20" w:name="_Toc231814596"/>
       <w:r>
         <w:rPr>
           <w:rFonts w:eastAsia="Times New Roman"/>
@@ -10511,7 +10505,7 @@
         <w:pStyle w:val="Caption"/>
         <w:keepNext/>
       </w:pPr>
-      <w:bookmarkStart w:id="21" w:name="_Toc231803165"/>
+      <w:bookmarkStart w:id="21" w:name="_Toc231814680"/>
       <w:r>
         <w:t xml:space="preserve">Bảng </w:t>
       </w:r>
@@ -11002,7 +10996,6 @@
                 <w:b w:val="0"/>
                 <w:bCs w:val="0"/>
               </w:rPr>
-              <w:lastRenderedPageBreak/>
               <w:t>Nhận xét HTML</w:t>
             </w:r>
           </w:p>
@@ -11046,8 +11039,9 @@
       <w:pPr>
         <w:pStyle w:val="Heading3"/>
       </w:pPr>
-      <w:bookmarkStart w:id="22" w:name="_Toc231803074"/>
-      <w:r>
+      <w:bookmarkStart w:id="22" w:name="_Toc231814597"/>
+      <w:r>
+        <w:lastRenderedPageBreak/>
         <w:t>Các thẻ HTML cơ bản</w:t>
       </w:r>
       <w:bookmarkEnd w:id="22"/>
@@ -11056,7 +11050,7 @@
       <w:pPr>
         <w:pStyle w:val="Heading4"/>
       </w:pPr>
-      <w:bookmarkStart w:id="23" w:name="_Toc231803075"/>
+      <w:bookmarkStart w:id="23" w:name="_Toc231814598"/>
       <w:r>
         <w:t>Thẻ văn bản</w:t>
       </w:r>
@@ -11067,7 +11061,7 @@
         <w:pStyle w:val="Caption"/>
         <w:keepNext/>
       </w:pPr>
-      <w:bookmarkStart w:id="24" w:name="_Toc231803166"/>
+      <w:bookmarkStart w:id="24" w:name="_Toc231814681"/>
       <w:r>
         <w:t xml:space="preserve">Bảng </w:t>
       </w:r>
@@ -11483,7 +11477,7 @@
       <w:pPr>
         <w:pStyle w:val="Heading4"/>
       </w:pPr>
-      <w:bookmarkStart w:id="25" w:name="_Toc231803076"/>
+      <w:bookmarkStart w:id="25" w:name="_Toc231814599"/>
       <w:r>
         <w:t>Thẻ liên kết và hình ảnh</w:t>
       </w:r>
@@ -11494,7 +11488,7 @@
         <w:pStyle w:val="Caption"/>
         <w:keepNext/>
       </w:pPr>
-      <w:bookmarkStart w:id="26" w:name="_Toc231803167"/>
+      <w:bookmarkStart w:id="26" w:name="_Toc231814682"/>
       <w:r>
         <w:t xml:space="preserve">Bảng </w:t>
       </w:r>
@@ -11696,7 +11690,6 @@
                 <w:sz w:val="26"/>
                 <w:szCs w:val="22"/>
               </w:rPr>
-              <w:lastRenderedPageBreak/>
               <w:t>&lt;img&gt;</w:t>
             </w:r>
             <w:r>
@@ -11725,7 +11718,11 @@
               <w:t>src</w:t>
             </w:r>
             <w:r>
-              <w:t xml:space="preserve"> (đường dẫn ảnh), </w:t>
+              <w:t xml:space="preserve"> (đường dẫn </w:t>
+            </w:r>
+            <w:r>
+              <w:lastRenderedPageBreak/>
+              <w:t xml:space="preserve">ảnh), </w:t>
             </w:r>
             <w:r>
               <w:rPr>
@@ -11756,6 +11753,7 @@
                 <w:sz w:val="26"/>
                 <w:szCs w:val="22"/>
               </w:rPr>
+              <w:lastRenderedPageBreak/>
               <w:t>&lt;img src="flower.jpg" alt="Hình ảnh một bông hoa"&gt;</w:t>
             </w:r>
           </w:p>
@@ -11767,7 +11765,7 @@
       <w:pPr>
         <w:pStyle w:val="Heading4"/>
       </w:pPr>
-      <w:bookmarkStart w:id="27" w:name="_Toc231803077"/>
+      <w:bookmarkStart w:id="27" w:name="_Toc231814600"/>
       <w:r>
         <w:t>Danh sách trong HTML</w:t>
       </w:r>
@@ -11778,7 +11776,7 @@
         <w:pStyle w:val="Caption"/>
         <w:keepNext/>
       </w:pPr>
-      <w:bookmarkStart w:id="28" w:name="_Toc231803168"/>
+      <w:bookmarkStart w:id="28" w:name="_Toc231814683"/>
       <w:r>
         <w:t xml:space="preserve">Bảng </w:t>
       </w:r>
@@ -12168,7 +12166,7 @@
       <w:pPr>
         <w:pStyle w:val="Heading4"/>
       </w:pPr>
-      <w:bookmarkStart w:id="29" w:name="_Toc231803078"/>
+      <w:bookmarkStart w:id="29" w:name="_Toc231814601"/>
       <w:r>
         <w:t>Thẻ bố cục</w:t>
       </w:r>
@@ -12178,7 +12176,7 @@
       <w:pPr>
         <w:pStyle w:val="Caption"/>
       </w:pPr>
-      <w:bookmarkStart w:id="30" w:name="_Toc231803169"/>
+      <w:bookmarkStart w:id="30" w:name="_Toc231814684"/>
       <w:r>
         <w:t xml:space="preserve">Bảng </w:t>
       </w:r>
@@ -12441,7 +12439,7 @@
       <w:pPr>
         <w:pStyle w:val="Heading4"/>
       </w:pPr>
-      <w:bookmarkStart w:id="31" w:name="_Toc231803079"/>
+      <w:bookmarkStart w:id="31" w:name="_Toc231814602"/>
       <w:r>
         <w:lastRenderedPageBreak/>
         <w:t>Biểu mẫu trong HTML</w:t>
@@ -12453,7 +12451,7 @@
         <w:pStyle w:val="Caption"/>
         <w:keepNext/>
       </w:pPr>
-      <w:bookmarkStart w:id="32" w:name="_Toc231803170"/>
+      <w:bookmarkStart w:id="32" w:name="_Toc231814685"/>
       <w:r>
         <w:t xml:space="preserve">Bảng </w:t>
       </w:r>
@@ -12797,7 +12795,7 @@
       <w:pPr>
         <w:pStyle w:val="Heading3"/>
       </w:pPr>
-      <w:bookmarkStart w:id="33" w:name="_Toc231803080"/>
+      <w:bookmarkStart w:id="33" w:name="_Toc231814603"/>
       <w:r>
         <w:t>HTML5 và các cải tiến mới</w:t>
       </w:r>
@@ -12807,7 +12805,7 @@
       <w:pPr>
         <w:pStyle w:val="Heading4"/>
       </w:pPr>
-      <w:bookmarkStart w:id="34" w:name="_Toc231803081"/>
+      <w:bookmarkStart w:id="34" w:name="_Toc231814604"/>
       <w:r>
         <w:t>HTML5 là gì?</w:t>
       </w:r>
@@ -12825,7 +12823,7 @@
       <w:pPr>
         <w:pStyle w:val="Heading4"/>
       </w:pPr>
-      <w:bookmarkStart w:id="35" w:name="_Toc231803082"/>
+      <w:bookmarkStart w:id="35" w:name="_Toc231814605"/>
       <w:r>
         <w:t>Cải tiến mới của HTML5</w:t>
       </w:r>
@@ -12915,7 +12913,7 @@
       <w:pPr>
         <w:pStyle w:val="Heading4"/>
       </w:pPr>
-      <w:bookmarkStart w:id="36" w:name="_Toc231803083"/>
+      <w:bookmarkStart w:id="36" w:name="_Toc231814606"/>
       <w:r>
         <w:t>Điểm khác biệt giữa HTML và HTML5</w:t>
       </w:r>
@@ -12955,7 +12953,7 @@
       <w:pPr>
         <w:pStyle w:val="Heading2"/>
       </w:pPr>
-      <w:bookmarkStart w:id="37" w:name="_Toc231803084"/>
+      <w:bookmarkStart w:id="37" w:name="_Toc231814607"/>
       <w:r>
         <w:lastRenderedPageBreak/>
         <w:t>CSS</w:t>
@@ -12966,7 +12964,7 @@
       <w:pPr>
         <w:pStyle w:val="Heading3"/>
       </w:pPr>
-      <w:bookmarkStart w:id="38" w:name="_Toc231803085"/>
+      <w:bookmarkStart w:id="38" w:name="_Toc231814608"/>
       <w:r>
         <w:t>CSS cơ bản</w:t>
       </w:r>
@@ -12976,7 +12974,7 @@
       <w:pPr>
         <w:pStyle w:val="Heading4"/>
       </w:pPr>
-      <w:bookmarkStart w:id="39" w:name="_Toc231803086"/>
+      <w:bookmarkStart w:id="39" w:name="_Toc231814609"/>
       <w:r>
         <w:t>Khái niệm và vai trò</w:t>
       </w:r>
@@ -13389,7 +13387,7 @@
       <w:pPr>
         <w:pStyle w:val="Heading4"/>
       </w:pPr>
-      <w:bookmarkStart w:id="40" w:name="_Toc231803087"/>
+      <w:bookmarkStart w:id="40" w:name="_Toc231814610"/>
       <w:r>
         <w:t>Các thuộc tính định dạng văn bản</w:t>
       </w:r>
@@ -13738,7 +13736,7 @@
       <w:pPr>
         <w:pStyle w:val="Heading4"/>
       </w:pPr>
-      <w:bookmarkStart w:id="41" w:name="_Toc231803088"/>
+      <w:bookmarkStart w:id="41" w:name="_Toc231814611"/>
       <w:r>
         <w:t>Các thuộc tính bố cục</w:t>
       </w:r>
@@ -14254,7 +14252,7 @@
       <w:pPr>
         <w:pStyle w:val="Heading3"/>
       </w:pPr>
-      <w:bookmarkStart w:id="42" w:name="_Toc231803089"/>
+      <w:bookmarkStart w:id="42" w:name="_Toc231814612"/>
       <w:r>
         <w:lastRenderedPageBreak/>
         <w:t>CSS nâng cao</w:t>
@@ -14540,7 +14538,7 @@
         <w:pStyle w:val="Caption"/>
         <w:keepNext/>
       </w:pPr>
-      <w:bookmarkStart w:id="43" w:name="_Toc231803171"/>
+      <w:bookmarkStart w:id="43" w:name="_Toc231814686"/>
       <w:r>
         <w:lastRenderedPageBreak/>
         <w:t xml:space="preserve">Bảng </w:t>
@@ -15234,7 +15232,7 @@
       <w:pPr>
         <w:pStyle w:val="Heading4"/>
       </w:pPr>
-      <w:bookmarkStart w:id="44" w:name="_Toc231803090"/>
+      <w:bookmarkStart w:id="44" w:name="_Toc231814613"/>
       <w:r>
         <w:t>Responsive design</w:t>
       </w:r>
@@ -15280,7 +15278,7 @@
       <w:pPr>
         <w:pStyle w:val="Heading4"/>
       </w:pPr>
-      <w:bookmarkStart w:id="45" w:name="_Toc231803091"/>
+      <w:bookmarkStart w:id="45" w:name="_Toc231814614"/>
       <w:r>
         <w:t>Bootstrap Framework</w:t>
       </w:r>
@@ -15362,7 +15360,7 @@
         <w:pStyle w:val="Caption"/>
         <w:keepNext/>
       </w:pPr>
-      <w:bookmarkStart w:id="46" w:name="_Toc231803172"/>
+      <w:bookmarkStart w:id="46" w:name="_Toc231814687"/>
       <w:r>
         <w:t xml:space="preserve">Bảng </w:t>
       </w:r>
@@ -15784,7 +15782,7 @@
       <w:pPr>
         <w:pStyle w:val="Heading2"/>
       </w:pPr>
-      <w:bookmarkStart w:id="47" w:name="_Toc231803092"/>
+      <w:bookmarkStart w:id="47" w:name="_Toc231814615"/>
       <w:r>
         <w:t>Javascript</w:t>
       </w:r>
@@ -15794,7 +15792,7 @@
       <w:pPr>
         <w:pStyle w:val="Heading3"/>
       </w:pPr>
-      <w:bookmarkStart w:id="48" w:name="_Toc231803093"/>
+      <w:bookmarkStart w:id="48" w:name="_Toc231814616"/>
       <w:r>
         <w:t>Khái niệm và vai trò</w:t>
       </w:r>
@@ -15804,7 +15802,7 @@
       <w:pPr>
         <w:pStyle w:val="Heading4"/>
       </w:pPr>
-      <w:bookmarkStart w:id="49" w:name="_Toc231803094"/>
+      <w:bookmarkStart w:id="49" w:name="_Toc231814617"/>
       <w:r>
         <w:t>JavaScript là gì?</w:t>
       </w:r>
@@ -15828,7 +15826,7 @@
       <w:pPr>
         <w:pStyle w:val="Heading4"/>
       </w:pPr>
-      <w:bookmarkStart w:id="50" w:name="_Toc231803095"/>
+      <w:bookmarkStart w:id="50" w:name="_Toc231814618"/>
       <w:r>
         <w:t>Vai trò của JavaScript</w:t>
       </w:r>
@@ -15850,7 +15848,7 @@
         <w:pStyle w:val="Caption"/>
         <w:keepNext/>
       </w:pPr>
-      <w:bookmarkStart w:id="51" w:name="_Toc231803173"/>
+      <w:bookmarkStart w:id="51" w:name="_Toc231814688"/>
       <w:r>
         <w:t xml:space="preserve">Bảng </w:t>
       </w:r>
@@ -16134,7 +16132,7 @@
       <w:pPr>
         <w:pStyle w:val="Heading3"/>
       </w:pPr>
-      <w:bookmarkStart w:id="52" w:name="_Toc231803096"/>
+      <w:bookmarkStart w:id="52" w:name="_Toc231814619"/>
       <w:r>
         <w:t>Các cú pháp cơ bản</w:t>
       </w:r>
@@ -16147,7 +16145,7 @@
       <w:pPr>
         <w:pStyle w:val="Heading4"/>
       </w:pPr>
-      <w:bookmarkStart w:id="53" w:name="_Toc231803097"/>
+      <w:bookmarkStart w:id="53" w:name="_Toc231814620"/>
       <w:r>
         <w:t>Giá trị cú pháp</w:t>
       </w:r>
@@ -16246,7 +16244,7 @@
       <w:pPr>
         <w:pStyle w:val="Heading4"/>
       </w:pPr>
-      <w:bookmarkStart w:id="54" w:name="_Toc231803098"/>
+      <w:bookmarkStart w:id="54" w:name="_Toc231814621"/>
       <w:r>
         <w:rPr>
           <w:lang w:val="en-US"/>
@@ -16313,7 +16311,7 @@
       <w:pPr>
         <w:pStyle w:val="Heading4"/>
       </w:pPr>
-      <w:bookmarkStart w:id="55" w:name="_Toc231803099"/>
+      <w:bookmarkStart w:id="55" w:name="_Toc231814622"/>
       <w:r>
         <w:t>Mã định danh JavaScript</w:t>
       </w:r>
@@ -16452,7 +16450,7 @@
       <w:pPr>
         <w:pStyle w:val="Heading4"/>
       </w:pPr>
-      <w:bookmarkStart w:id="56" w:name="_Toc231803100"/>
+      <w:bookmarkStart w:id="56" w:name="_Toc231814623"/>
       <w:r>
         <w:t>Event Handling</w:t>
       </w:r>
@@ -16535,7 +16533,7 @@
       <w:pPr>
         <w:pStyle w:val="Heading3"/>
       </w:pPr>
-      <w:bookmarkStart w:id="57" w:name="_Toc231803101"/>
+      <w:bookmarkStart w:id="57" w:name="_Toc231814624"/>
       <w:r>
         <w:t>DOM manipulation</w:t>
       </w:r>
@@ -16865,7 +16863,7 @@
       <w:pPr>
         <w:pStyle w:val="Heading1"/>
       </w:pPr>
-      <w:bookmarkStart w:id="58" w:name="_Toc231803102"/>
+      <w:bookmarkStart w:id="58" w:name="_Toc231814625"/>
       <w:r>
         <w:rPr>
           <w:caps w:val="0"/>
@@ -16879,7 +16877,7 @@
       <w:pPr>
         <w:pStyle w:val="Heading2"/>
       </w:pPr>
-      <w:bookmarkStart w:id="59" w:name="_Toc231803103"/>
+      <w:bookmarkStart w:id="59" w:name="_Toc231814626"/>
       <w:r>
         <w:t>Mô tả vấn đề</w:t>
       </w:r>
@@ -16913,7 +16911,7 @@
       <w:pPr>
         <w:pStyle w:val="Heading2"/>
       </w:pPr>
-      <w:bookmarkStart w:id="60" w:name="_Toc231803104"/>
+      <w:bookmarkStart w:id="60" w:name="_Toc231814627"/>
       <w:r>
         <w:t>Đặc tả yêu cầu hệ thống</w:t>
       </w:r>
@@ -16923,7 +16921,7 @@
       <w:pPr>
         <w:pStyle w:val="Heading3"/>
       </w:pPr>
-      <w:bookmarkStart w:id="61" w:name="_Toc231803105"/>
+      <w:bookmarkStart w:id="61" w:name="_Toc231814628"/>
       <w:r>
         <w:t>Yêu cầu chức năng</w:t>
       </w:r>
@@ -16965,7 +16963,7 @@
       <w:pPr>
         <w:pStyle w:val="Heading3"/>
       </w:pPr>
-      <w:bookmarkStart w:id="62" w:name="_Toc231803106"/>
+      <w:bookmarkStart w:id="62" w:name="_Toc231814629"/>
       <w:r>
         <w:t>Yêu cầu phi chức năng</w:t>
       </w:r>
@@ -16983,7 +16981,7 @@
       <w:pPr>
         <w:pStyle w:val="Heading4"/>
       </w:pPr>
-      <w:bookmarkStart w:id="63" w:name="_Toc231803107"/>
+      <w:bookmarkStart w:id="63" w:name="_Toc231814630"/>
       <w:r>
         <w:t xml:space="preserve">Hiệu </w:t>
       </w:r>
@@ -17023,7 +17021,7 @@
           <w:lang w:val="en-US"/>
         </w:rPr>
       </w:pPr>
-      <w:bookmarkStart w:id="64" w:name="_Toc231803108"/>
+      <w:bookmarkStart w:id="64" w:name="_Toc231814631"/>
       <w:r>
         <w:rPr>
           <w:lang w:val="en-US"/>
@@ -17064,7 +17062,7 @@
           <w:lang w:val="en-US"/>
         </w:rPr>
       </w:pPr>
-      <w:bookmarkStart w:id="65" w:name="_Toc231803109"/>
+      <w:bookmarkStart w:id="65" w:name="_Toc231814632"/>
       <w:r>
         <w:rPr>
           <w:lang w:val="en-US"/>
@@ -17108,7 +17106,7 @@
           <w:lang w:val="en-US"/>
         </w:rPr>
       </w:pPr>
-      <w:bookmarkStart w:id="66" w:name="_Toc231803110"/>
+      <w:bookmarkStart w:id="66" w:name="_Toc231814633"/>
       <w:r>
         <w:rPr>
           <w:lang w:val="en-US"/>
@@ -17154,7 +17152,7 @@
           <w:lang w:val="en-US"/>
         </w:rPr>
       </w:pPr>
-      <w:bookmarkStart w:id="67" w:name="_Toc231803111"/>
+      <w:bookmarkStart w:id="67" w:name="_Toc231814634"/>
       <w:r>
         <w:rPr>
           <w:lang w:val="en-US"/>
@@ -17195,7 +17193,7 @@
       <w:pPr>
         <w:pStyle w:val="Heading2"/>
       </w:pPr>
-      <w:bookmarkStart w:id="68" w:name="_Toc231803112"/>
+      <w:bookmarkStart w:id="68" w:name="_Toc231814635"/>
       <w:r>
         <w:t>Thiết kế dữ liệu</w:t>
       </w:r>
@@ -17205,7 +17203,7 @@
       <w:pPr>
         <w:pStyle w:val="Heading3"/>
       </w:pPr>
-      <w:bookmarkStart w:id="69" w:name="_Toc231803113"/>
+      <w:bookmarkStart w:id="69" w:name="_Toc231814636"/>
       <w:r>
         <w:t>Cấu trúc lưu trữ</w:t>
       </w:r>
@@ -17269,7 +17267,7 @@
       <w:pPr>
         <w:pStyle w:val="Heading3"/>
       </w:pPr>
-      <w:bookmarkStart w:id="70" w:name="_Toc231803114"/>
+      <w:bookmarkStart w:id="70" w:name="_Toc231814637"/>
       <w:r>
         <w:t>Đặc tả chi tiết</w:t>
       </w:r>
@@ -17695,7 +17693,7 @@
       <w:pPr>
         <w:pStyle w:val="Heading2"/>
       </w:pPr>
-      <w:bookmarkStart w:id="71" w:name="_Toc231803115"/>
+      <w:bookmarkStart w:id="71" w:name="_Toc231814638"/>
       <w:r>
         <w:t>Thiết kế chức năng</w:t>
       </w:r>
@@ -17794,7 +17792,7 @@
       <w:pPr>
         <w:pStyle w:val="Heading2"/>
       </w:pPr>
-      <w:bookmarkStart w:id="72" w:name="_Toc231803116"/>
+      <w:bookmarkStart w:id="72" w:name="_Toc231814639"/>
       <w:r>
         <w:lastRenderedPageBreak/>
         <w:t>Thiết kế giao diện</w:t>
@@ -17805,7 +17803,7 @@
       <w:pPr>
         <w:pStyle w:val="Heading3"/>
       </w:pPr>
-      <w:bookmarkStart w:id="73" w:name="_Toc231803117"/>
+      <w:bookmarkStart w:id="73" w:name="_Toc231814640"/>
       <w:r>
         <w:t>Sơ đồ website</w:t>
       </w:r>
@@ -17926,7 +17924,7 @@
       <w:pPr>
         <w:pStyle w:val="Heading3"/>
       </w:pPr>
-      <w:bookmarkStart w:id="74" w:name="_Toc231803118"/>
+      <w:bookmarkStart w:id="74" w:name="_Toc231814641"/>
       <w:r>
         <w:t>Giao diện trang chủ</w:t>
       </w:r>
@@ -17971,7 +17969,7 @@
           <w:lang w:val="en-US"/>
         </w:rPr>
       </w:pPr>
-      <w:bookmarkStart w:id="75" w:name="_Toc231803119"/>
+      <w:bookmarkStart w:id="75" w:name="_Toc231814642"/>
       <w:r>
         <w:rPr>
           <w:lang w:val="en-US"/>
@@ -18017,7 +18015,7 @@
       <w:pPr>
         <w:pStyle w:val="Heading3"/>
       </w:pPr>
-      <w:bookmarkStart w:id="76" w:name="_Toc231803120"/>
+      <w:bookmarkStart w:id="76" w:name="_Toc231814643"/>
       <w:r>
         <w:t>Giao diện trang</w:t>
       </w:r>
@@ -18057,7 +18055,7 @@
           <w:lang w:val="en-US"/>
         </w:rPr>
       </w:pPr>
-      <w:bookmarkStart w:id="77" w:name="_Toc231803121"/>
+      <w:bookmarkStart w:id="77" w:name="_Toc231814644"/>
       <w:r>
         <w:rPr>
           <w:lang w:val="en-US"/>
@@ -18097,7 +18095,7 @@
           <w:lang w:val="en-US"/>
         </w:rPr>
       </w:pPr>
-      <w:bookmarkStart w:id="78" w:name="_Toc231803122"/>
+      <w:bookmarkStart w:id="78" w:name="_Toc231814645"/>
       <w:r>
         <w:rPr>
           <w:lang w:val="en-US"/>
@@ -18142,7 +18140,7 @@
       <w:pPr>
         <w:pStyle w:val="Heading3"/>
       </w:pPr>
-      <w:bookmarkStart w:id="79" w:name="_Toc231803123"/>
+      <w:bookmarkStart w:id="79" w:name="_Toc231814646"/>
       <w:r>
         <w:lastRenderedPageBreak/>
         <w:t>Giao diện trang quản lý sản phẩm</w:t>
@@ -18174,7 +18172,13 @@
         </w:numPr>
       </w:pPr>
       <w:r>
-        <w:t>Cung cấp giao diện nhập liệu trực quan bao gồm các trường: Tên sản phẩm, Giá bán (VND), Đường dẫn hình ảnh (liên kết đến thư mục assets) và Trạng thái sản phẩm (ví dụ: Còn hàng/Hết hàng).</w:t>
+        <w:t xml:space="preserve">Cung cấp giao diện nhập liệu trực quan bao gồm các trường: Tên sản phẩm, Giá bán (VND), Đường dẫn hình ảnh (liên kết đến thư mục assets) và Trạng thái sản phẩm (ví dụ: Còn hàng/Hết </w:t>
+      </w:r>
+      <w:r>
+        <w:t>hàng/Ngừng kinh doanh</w:t>
+      </w:r>
+      <w:r>
+        <w:t>).</w:t>
       </w:r>
     </w:p>
     <w:p>
@@ -18272,7 +18276,7 @@
       <w:pPr>
         <w:pStyle w:val="Heading1"/>
       </w:pPr>
-      <w:bookmarkStart w:id="80" w:name="_Toc231803124"/>
+      <w:bookmarkStart w:id="80" w:name="_Toc231814647"/>
       <w:r>
         <w:lastRenderedPageBreak/>
         <w:t>KẾT QUẢ THỰC NGHIỆM</w:t>
@@ -18283,7 +18287,7 @@
       <w:pPr>
         <w:pStyle w:val="Heading2"/>
       </w:pPr>
-      <w:bookmarkStart w:id="81" w:name="_Toc231803125"/>
+      <w:bookmarkStart w:id="81" w:name="_Toc231814648"/>
       <w:r>
         <w:t>Dữ liệu thử nghiệm</w:t>
       </w:r>
@@ -18293,7 +18297,7 @@
       <w:pPr>
         <w:pStyle w:val="Heading3"/>
       </w:pPr>
-      <w:bookmarkStart w:id="82" w:name="_Toc231803126"/>
+      <w:bookmarkStart w:id="82" w:name="_Toc231814649"/>
       <w:r>
         <w:t>Nguồn dữ liệu</w:t>
       </w:r>
@@ -18465,7 +18469,7 @@
       <w:pPr>
         <w:pStyle w:val="Heading3"/>
       </w:pPr>
-      <w:bookmarkStart w:id="83" w:name="_Toc231803127"/>
+      <w:bookmarkStart w:id="83" w:name="_Toc231814650"/>
       <w:r>
         <w:lastRenderedPageBreak/>
         <w:t>Danh mục sản phẩm</w:t>
@@ -18556,7 +18560,7 @@
       <w:pPr>
         <w:pStyle w:val="Heading3"/>
       </w:pPr>
-      <w:bookmarkStart w:id="84" w:name="_Toc231803128"/>
+      <w:bookmarkStart w:id="84" w:name="_Toc231814651"/>
       <w:r>
         <w:t>Chi tiết sản phẩm</w:t>
       </w:r>
@@ -18567,7 +18571,7 @@
         <w:pStyle w:val="Caption"/>
         <w:keepNext/>
       </w:pPr>
-      <w:bookmarkStart w:id="85" w:name="_Toc231803174"/>
+      <w:bookmarkStart w:id="85" w:name="_Toc231814689"/>
       <w:r>
         <w:t xml:space="preserve">Bảng </w:t>
       </w:r>
@@ -20006,7 +20010,6 @@
           </w:tcPr>
           <w:p>
             <w:r>
-              <w:lastRenderedPageBreak/>
               <w:t>20</w:t>
             </w:r>
           </w:p>
@@ -20070,7 +20073,7 @@
       <w:pPr>
         <w:pStyle w:val="Heading3"/>
       </w:pPr>
-      <w:bookmarkStart w:id="86" w:name="_Toc231803129"/>
+      <w:bookmarkStart w:id="86" w:name="_Toc231814652"/>
       <w:r>
         <w:t>Môi trường thử nghiệm</w:t>
       </w:r>
@@ -20112,7 +20115,7 @@
       <w:pPr>
         <w:pStyle w:val="Heading3"/>
       </w:pPr>
-      <w:bookmarkStart w:id="87" w:name="_Toc231803130"/>
+      <w:bookmarkStart w:id="87" w:name="_Toc231814653"/>
       <w:r>
         <w:t>Tiêu chí kiểm thử</w:t>
       </w:r>
@@ -20162,7 +20165,7 @@
       <w:pPr>
         <w:pStyle w:val="Heading2"/>
       </w:pPr>
-      <w:bookmarkStart w:id="88" w:name="_Toc231803131"/>
+      <w:bookmarkStart w:id="88" w:name="_Toc231814654"/>
       <w:r>
         <w:t>Kết quả thực nghiệm</w:t>
       </w:r>
@@ -20172,7 +20175,7 @@
       <w:pPr>
         <w:pStyle w:val="Heading3"/>
       </w:pPr>
-      <w:bookmarkStart w:id="89" w:name="_Toc231803132"/>
+      <w:bookmarkStart w:id="89" w:name="_Toc231814655"/>
       <w:r>
         <w:t>Quy chuẩn giao diện chung</w:t>
       </w:r>
@@ -20343,7 +20346,7 @@
       <w:pPr>
         <w:pStyle w:val="Heading3"/>
       </w:pPr>
-      <w:bookmarkStart w:id="90" w:name="_Toc231803133"/>
+      <w:bookmarkStart w:id="90" w:name="_Toc231814656"/>
       <w:r>
         <w:t>Giao diện trang chủ</w:t>
       </w:r>
@@ -20401,7 +20404,7 @@
       <w:pPr>
         <w:pStyle w:val="Caption"/>
       </w:pPr>
-      <w:bookmarkStart w:id="91" w:name="_Toc231803154"/>
+      <w:bookmarkStart w:id="91" w:name="_Toc231814669"/>
       <w:r>
         <w:t xml:space="preserve">Hình </w:t>
       </w:r>
@@ -20492,7 +20495,7 @@
       <w:pPr>
         <w:pStyle w:val="Heading3"/>
       </w:pPr>
-      <w:bookmarkStart w:id="92" w:name="_Toc231803134"/>
+      <w:bookmarkStart w:id="92" w:name="_Toc231814657"/>
       <w:r>
         <w:t>Giao diện trang</w:t>
       </w:r>
@@ -20552,7 +20555,7 @@
       <w:pPr>
         <w:pStyle w:val="Caption"/>
       </w:pPr>
-      <w:bookmarkStart w:id="93" w:name="_Toc231803155"/>
+      <w:bookmarkStart w:id="93" w:name="_Toc231814670"/>
       <w:r>
         <w:t xml:space="preserve">Hình </w:t>
       </w:r>
@@ -20642,7 +20645,7 @@
       <w:pPr>
         <w:pStyle w:val="Heading3"/>
       </w:pPr>
-      <w:bookmarkStart w:id="94" w:name="_Toc231803135"/>
+      <w:bookmarkStart w:id="94" w:name="_Toc231814658"/>
       <w:r>
         <w:lastRenderedPageBreak/>
         <w:t>Giao diện trang liên hệ</w:t>
@@ -20701,7 +20704,7 @@
       <w:pPr>
         <w:pStyle w:val="noidung"/>
       </w:pPr>
-      <w:bookmarkStart w:id="95" w:name="_Toc231803156"/>
+      <w:bookmarkStart w:id="95" w:name="_Toc231814671"/>
       <w:r>
         <w:t xml:space="preserve">Hình </w:t>
       </w:r>
@@ -20788,7 +20791,7 @@
       <w:pPr>
         <w:pStyle w:val="Heading3"/>
       </w:pPr>
-      <w:bookmarkStart w:id="96" w:name="_Toc231803136"/>
+      <w:bookmarkStart w:id="96" w:name="_Toc231814659"/>
       <w:r>
         <w:t>Giao diện trang sản phẩm</w:t>
       </w:r>
@@ -20869,8 +20872,8 @@
       </w:r>
       <w:r>
         <w:drawing>
-          <wp:inline distT="0" distB="0" distL="0" distR="0" wp14:anchorId="629E6A28" wp14:editId="74A369AF">
-            <wp:extent cx="5148000" cy="2603875"/>
+          <wp:inline distT="0" distB="0" distL="0" distR="0" wp14:anchorId="629E6A28" wp14:editId="479A39AD">
+            <wp:extent cx="5148000" cy="2584769"/>
             <wp:effectExtent l="19050" t="19050" r="14605" b="25400"/>
             <wp:docPr id="191683979" name="Picture 1"/>
             <wp:cNvGraphicFramePr>
@@ -20880,11 +20883,17 @@
               <a:graphicData uri="http://schemas.openxmlformats.org/drawingml/2006/picture">
                 <pic:pic xmlns:pic="http://schemas.openxmlformats.org/drawingml/2006/picture">
                   <pic:nvPicPr>
-                    <pic:cNvPr id="191683979" name=""/>
+                    <pic:cNvPr id="191683979" name="Picture 1"/>
                     <pic:cNvPicPr/>
                   </pic:nvPicPr>
                   <pic:blipFill>
-                    <a:blip r:embed="rId23"/>
+                    <a:blip r:embed="rId23" cstate="print">
+                      <a:extLst>
+                        <a:ext uri="{28A0092B-C50C-407E-A947-70E740481C1C}">
+                          <a14:useLocalDpi xmlns:a14="http://schemas.microsoft.com/office/drawing/2010/main" val="0"/>
+                        </a:ext>
+                      </a:extLst>
+                    </a:blip>
                     <a:stretch>
                       <a:fillRect/>
                     </a:stretch>
@@ -20892,7 +20901,7 @@
                   <pic:spPr>
                     <a:xfrm>
                       <a:off x="0" y="0"/>
-                      <a:ext cx="5148000" cy="2603875"/>
+                      <a:ext cx="5148000" cy="2584769"/>
                     </a:xfrm>
                     <a:prstGeom prst="rect">
                       <a:avLst/>
@@ -20914,7 +20923,7 @@
       <w:pPr>
         <w:pStyle w:val="Caption"/>
       </w:pPr>
-      <w:bookmarkStart w:id="97" w:name="_Toc231803157"/>
+      <w:bookmarkStart w:id="97" w:name="_Toc231814672"/>
       <w:r>
         <w:lastRenderedPageBreak/>
         <w:t xml:space="preserve">Hình </w:t>
@@ -21119,7 +21128,7 @@
       <w:pPr>
         <w:pStyle w:val="Heading3"/>
       </w:pPr>
-      <w:bookmarkStart w:id="98" w:name="_Toc231803137"/>
+      <w:bookmarkStart w:id="98" w:name="_Toc231814660"/>
       <w:r>
         <w:t>Giao diện trang chi tiết sản phẩm</w:t>
       </w:r>
@@ -21131,9 +21140,9 @@
       </w:pPr>
       <w:r>
         <w:drawing>
-          <wp:inline distT="0" distB="0" distL="0" distR="0" wp14:anchorId="442B3316" wp14:editId="1A1B0A1F">
-            <wp:extent cx="5148000" cy="2603875"/>
-            <wp:effectExtent l="0" t="0" r="0" b="6350"/>
+          <wp:inline distT="0" distB="0" distL="0" distR="0" wp14:anchorId="442B3316" wp14:editId="582D5F00">
+            <wp:extent cx="5148000" cy="2587462"/>
+            <wp:effectExtent l="0" t="0" r="0" b="3810"/>
             <wp:docPr id="1091918386" name="Picture 1"/>
             <wp:cNvGraphicFramePr>
               <a:graphicFrameLocks xmlns:a="http://schemas.openxmlformats.org/drawingml/2006/main" noChangeAspect="1"/>
@@ -21142,11 +21151,17 @@
               <a:graphicData uri="http://schemas.openxmlformats.org/drawingml/2006/picture">
                 <pic:pic xmlns:pic="http://schemas.openxmlformats.org/drawingml/2006/picture">
                   <pic:nvPicPr>
-                    <pic:cNvPr id="1091918386" name=""/>
+                    <pic:cNvPr id="1091918386" name="Picture 1"/>
                     <pic:cNvPicPr/>
                   </pic:nvPicPr>
                   <pic:blipFill>
-                    <a:blip r:embed="rId24"/>
+                    <a:blip r:embed="rId24" cstate="print">
+                      <a:extLst>
+                        <a:ext uri="{28A0092B-C50C-407E-A947-70E740481C1C}">
+                          <a14:useLocalDpi xmlns:a14="http://schemas.microsoft.com/office/drawing/2010/main" val="0"/>
+                        </a:ext>
+                      </a:extLst>
+                    </a:blip>
                     <a:stretch>
                       <a:fillRect/>
                     </a:stretch>
@@ -21154,7 +21169,7 @@
                   <pic:spPr>
                     <a:xfrm>
                       <a:off x="0" y="0"/>
-                      <a:ext cx="5148000" cy="2603875"/>
+                      <a:ext cx="5148000" cy="2587462"/>
                     </a:xfrm>
                     <a:prstGeom prst="rect">
                       <a:avLst/>
@@ -21171,7 +21186,7 @@
       <w:pPr>
         <w:pStyle w:val="Caption"/>
       </w:pPr>
-      <w:bookmarkStart w:id="99" w:name="_Toc231803158"/>
+      <w:bookmarkStart w:id="99" w:name="_Toc231814673"/>
       <w:r>
         <w:t xml:space="preserve">Hình </w:t>
       </w:r>
@@ -21270,7 +21285,7 @@
       <w:pPr>
         <w:pStyle w:val="Caption"/>
       </w:pPr>
-      <w:bookmarkStart w:id="100" w:name="_Toc231803159"/>
+      <w:bookmarkStart w:id="100" w:name="_Toc231814674"/>
       <w:r>
         <w:t xml:space="preserve">Hình </w:t>
       </w:r>
@@ -21367,7 +21382,34 @@
         </w:numPr>
       </w:pPr>
       <w:r>
-        <w:t>Tên sản phẩm và giá bán được trình bày nổi bật.</w:t>
+        <w:t>Tên sản phẩm và giá bán: được trình bày nổi bật để người dùng dễ nhận biết</w:t>
+      </w:r>
+      <w:r>
+        <w:t>.</w:t>
+      </w:r>
+    </w:p>
+    <w:p>
+      <w:pPr>
+        <w:pStyle w:val="noidung"/>
+        <w:numPr>
+          <w:ilvl w:val="0"/>
+          <w:numId w:val="53"/>
+        </w:numPr>
+      </w:pPr>
+      <w:r>
+        <w:t>Trạng thái hoạt động: hiển thị rõ ràng (Còn hàng, Tạm hết hàng, Ngừng kinh doanh) giúp người dùng nắm bắt tình trạng kinh doanh.</w:t>
+      </w:r>
+    </w:p>
+    <w:p>
+      <w:pPr>
+        <w:pStyle w:val="noidung"/>
+        <w:numPr>
+          <w:ilvl w:val="0"/>
+          <w:numId w:val="54"/>
+        </w:numPr>
+      </w:pPr>
+      <w:r>
+        <w:t>Nút chức năng “Thêm vào giỏ hàng”: cho phép thêm sản phẩm vào giỏ. Nếu trạng thái sản phẩm là Tạm hết hàng hoặc Ngừng kinh doanh, nút này sẽ bị vô hiệu hóa để tránh thao tác không hợp lệ.</w:t>
       </w:r>
     </w:p>
     <w:p>
@@ -21379,7 +21421,7 @@
         </w:numPr>
       </w:pPr>
       <w:r>
-        <w:t>Nút chức năng “Thêm vào giỏ hàng” cho phép người dùng thêm sản phẩm vào giỏ.</w:t>
+        <w:t>Phần mô tả chi tiết với tiêu đề “Đặc điểm nổi bật”, liệt kê các thông số kỹ thuật và tính năng chính: màn hình Dynamic AMOLED 2X 6.8 inch, camera 200MP, chip Snapdragon 8 Gen 3, bút S Pen, hệ sinh thái Galaxy AI, pin 5000mAh hỗ trợ sạc nhanh 45W.</w:t>
       </w:r>
     </w:p>
     <w:p>
@@ -21391,18 +21433,7 @@
         </w:numPr>
       </w:pPr>
       <w:r>
-        <w:t>Phần mô tả chi tiết với tiêu đề “Đặc điểm nổi bật”, liệt kê các thông số kỹ thuật và tính năng chính: màn hình Dynamic AMOLED 2X 6.8 inch, camera 200MP, chip Snapdragon 8 Gen 3, bút S Pen, hệ sinh thái Galaxy AI, pin 5000mAh hỗ trợ sạc nhanh 45W.</w:t>
-      </w:r>
-    </w:p>
-    <w:p>
-      <w:pPr>
-        <w:pStyle w:val="noidung"/>
-        <w:numPr>
-          <w:ilvl w:val="0"/>
-          <w:numId w:val="40"/>
-        </w:numPr>
-      </w:pPr>
-      <w:r>
+        <w:lastRenderedPageBreak/>
         <w:t>Nội dung được trình bày theo dạng đoạn văn hoặc danh sách, giúp người dùng dễ dàng nắm bắt thông tin quan trọng.</w:t>
       </w:r>
     </w:p>
@@ -21410,9 +21441,8 @@
       <w:pPr>
         <w:pStyle w:val="Heading3"/>
       </w:pPr>
-      <w:bookmarkStart w:id="101" w:name="_Toc231803138"/>
-      <w:r>
-        <w:lastRenderedPageBreak/>
+      <w:bookmarkStart w:id="101" w:name="_Toc231814661"/>
+      <w:r>
         <w:t>Giao diện trang giỏ hàng</w:t>
       </w:r>
       <w:bookmarkEnd w:id="101"/>
@@ -21464,7 +21494,7 @@
       <w:pPr>
         <w:pStyle w:val="Caption"/>
       </w:pPr>
-      <w:bookmarkStart w:id="102" w:name="_Toc231803160"/>
+      <w:bookmarkStart w:id="102" w:name="_Toc231814675"/>
       <w:r>
         <w:t xml:space="preserve">Hình </w:t>
       </w:r>
@@ -21553,7 +21583,7 @@
       <w:pPr>
         <w:pStyle w:val="Caption"/>
       </w:pPr>
-      <w:bookmarkStart w:id="103" w:name="_Toc231803161"/>
+      <w:bookmarkStart w:id="103" w:name="_Toc231814676"/>
       <w:r>
         <w:t xml:space="preserve">Hình </w:t>
       </w:r>
@@ -21627,6 +21657,7 @@
         </w:numPr>
       </w:pPr>
       <w:r>
+        <w:lastRenderedPageBreak/>
         <w:t>Khu vực “Sản phẩm đã chọn” hiển thị danh sách sản phẩm mà người dùng thêm vào giỏ hàng, gồm tên, giá, số lượng và nút Xóa để loại bỏ sản phẩm.</w:t>
       </w:r>
     </w:p>
@@ -21639,7 +21670,6 @@
         </w:numPr>
       </w:pPr>
       <w:r>
-        <w:lastRenderedPageBreak/>
         <w:t>Khu vực “Chi tiết đơn hàng” hiển thị tổng hợp giá trị đơn hàng: tạm tính, phí giao hàng (miễn phí), tổng tiền thanh toán, cùng nút “Tiến hành thanh toán” để chuyển sang bước thanh toán.</w:t>
       </w:r>
     </w:p>
@@ -21683,7 +21713,7 @@
       <w:pPr>
         <w:pStyle w:val="Heading3"/>
       </w:pPr>
-      <w:bookmarkStart w:id="104" w:name="_Toc231803139"/>
+      <w:bookmarkStart w:id="104" w:name="_Toc231814662"/>
       <w:r>
         <w:t>Giao diện trang quản lý sản phẩm</w:t>
       </w:r>
@@ -21736,7 +21766,7 @@
       <w:pPr>
         <w:pStyle w:val="Caption"/>
       </w:pPr>
-      <w:bookmarkStart w:id="105" w:name="_Toc231803162"/>
+      <w:bookmarkStart w:id="105" w:name="_Toc231814677"/>
       <w:r>
         <w:t xml:space="preserve">Hình </w:t>
       </w:r>
@@ -21784,10 +21814,11 @@
         <w:keepNext/>
       </w:pPr>
       <w:r>
+        <w:lastRenderedPageBreak/>
         <w:drawing>
-          <wp:inline distT="0" distB="0" distL="0" distR="0" wp14:anchorId="0565E918" wp14:editId="5B7F8653">
-            <wp:extent cx="5148000" cy="2603617"/>
-            <wp:effectExtent l="0" t="0" r="0" b="6350"/>
+          <wp:inline distT="0" distB="0" distL="0" distR="0" wp14:anchorId="0565E918" wp14:editId="3A187AD7">
+            <wp:extent cx="5137229" cy="2603617"/>
+            <wp:effectExtent l="0" t="0" r="6350" b="6350"/>
             <wp:docPr id="87079256" name="Picture 1"/>
             <wp:cNvGraphicFramePr>
               <a:graphicFrameLocks xmlns:a="http://schemas.openxmlformats.org/drawingml/2006/main" noChangeAspect="1"/>
@@ -21814,7 +21845,7 @@
                   <pic:spPr>
                     <a:xfrm>
                       <a:off x="0" y="0"/>
-                      <a:ext cx="5148000" cy="2603617"/>
+                      <a:ext cx="5137229" cy="2603617"/>
                     </a:xfrm>
                     <a:prstGeom prst="rect">
                       <a:avLst/>
@@ -21831,7 +21862,7 @@
       <w:pPr>
         <w:pStyle w:val="Caption"/>
       </w:pPr>
-      <w:bookmarkStart w:id="106" w:name="_Toc231803163"/>
+      <w:bookmarkStart w:id="106" w:name="_Toc231814678"/>
       <w:r>
         <w:t xml:space="preserve">Hình </w:t>
       </w:r>
@@ -21878,7 +21909,6 @@
         <w:pStyle w:val="noidung"/>
       </w:pPr>
       <w:r>
-        <w:lastRenderedPageBreak/>
         <w:t xml:space="preserve">Trang Quản lý sản phẩm (Admin) trong hệ thống LinhTech Store được thiết kế như một bảng điều khiển quản trị, cho phép thêm mới, chỉnh sửa và xóa sản phẩm. </w:t>
       </w:r>
       <w:r>
@@ -21939,7 +21969,13 @@
         <w:t>9</w:t>
       </w:r>
       <w:r>
-        <w:t>90.000 – Còn hàng.</w:t>
+        <w:t xml:space="preserve">90.000 – </w:t>
+      </w:r>
+      <w:r>
+        <w:t>Hết</w:t>
+      </w:r>
+      <w:r>
+        <w:t xml:space="preserve"> hàng.</w:t>
       </w:r>
     </w:p>
     <w:p>
@@ -21985,7 +22021,7 @@
       <w:pPr>
         <w:pStyle w:val="Heading1"/>
       </w:pPr>
-      <w:bookmarkStart w:id="107" w:name="_Toc231803140"/>
+      <w:bookmarkStart w:id="107" w:name="_Toc231814663"/>
       <w:r>
         <w:rPr>
           <w:caps w:val="0"/>
@@ -21999,7 +22035,7 @@
       <w:pPr>
         <w:pStyle w:val="Heading2"/>
       </w:pPr>
-      <w:bookmarkStart w:id="108" w:name="_Toc231803141"/>
+      <w:bookmarkStart w:id="108" w:name="_Toc231814664"/>
       <w:r>
         <w:t>Kết luận</w:t>
       </w:r>
@@ -22017,7 +22053,7 @@
       <w:pPr>
         <w:pStyle w:val="Heading3"/>
       </w:pPr>
-      <w:bookmarkStart w:id="109" w:name="_Toc231803142"/>
+      <w:bookmarkStart w:id="109" w:name="_Toc231814665"/>
       <w:r>
         <w:t>Những hạn chế còn tồn tại</w:t>
       </w:r>
@@ -22086,7 +22122,7 @@
       <w:pPr>
         <w:pStyle w:val="Heading3"/>
       </w:pPr>
-      <w:bookmarkStart w:id="110" w:name="_Toc231803143"/>
+      <w:bookmarkStart w:id="110" w:name="_Toc231814666"/>
       <w:r>
         <w:lastRenderedPageBreak/>
         <w:t>Kỹ năng đã đạt được</w:t>
@@ -22189,7 +22225,7 @@
       <w:pPr>
         <w:pStyle w:val="Heading2"/>
       </w:pPr>
-      <w:bookmarkStart w:id="111" w:name="_Toc231803144"/>
+      <w:bookmarkStart w:id="111" w:name="_Toc231814667"/>
       <w:r>
         <w:t>Hướng phát triển</w:t>
       </w:r>
@@ -26362,6 +26398,118 @@
     </w:lvl>
   </w:abstractNum>
   <w:abstractNum w:abstractNumId="32" w15:restartNumberingAfterBreak="0">
+    <w:nsid w:val="5CAD25B6"/>
+    <w:multiLevelType w:val="hybridMultilevel"/>
+    <w:tmpl w:val="CE9817FA"/>
+    <w:lvl w:ilvl="0" w:tplc="FB406BF4">
+      <w:numFmt w:val="bullet"/>
+      <w:lvlText w:val="-"/>
+      <w:lvlJc w:val="left"/>
+      <w:pPr>
+        <w:ind w:left="1400" w:hanging="360"/>
+      </w:pPr>
+      <w:rPr>
+        <w:rFonts w:ascii="Aptos" w:eastAsiaTheme="minorHAnsi" w:hAnsi="Aptos" w:cstheme="minorBidi" w:hint="default"/>
+      </w:rPr>
+    </w:lvl>
+    <w:lvl w:ilvl="1" w:tplc="04090003" w:tentative="1">
+      <w:start w:val="1"/>
+      <w:numFmt w:val="bullet"/>
+      <w:lvlText w:val="o"/>
+      <w:lvlJc w:val="left"/>
+      <w:pPr>
+        <w:ind w:left="2120" w:hanging="360"/>
+      </w:pPr>
+      <w:rPr>
+        <w:rFonts w:ascii="Courier New" w:hAnsi="Courier New" w:cs="Courier New" w:hint="default"/>
+      </w:rPr>
+    </w:lvl>
+    <w:lvl w:ilvl="2" w:tplc="04090005" w:tentative="1">
+      <w:start w:val="1"/>
+      <w:numFmt w:val="bullet"/>
+      <w:lvlText w:val=""/>
+      <w:lvlJc w:val="left"/>
+      <w:pPr>
+        <w:ind w:left="2840" w:hanging="360"/>
+      </w:pPr>
+      <w:rPr>
+        <w:rFonts w:ascii="Wingdings" w:hAnsi="Wingdings" w:hint="default"/>
+      </w:rPr>
+    </w:lvl>
+    <w:lvl w:ilvl="3" w:tplc="04090001" w:tentative="1">
+      <w:start w:val="1"/>
+      <w:numFmt w:val="bullet"/>
+      <w:lvlText w:val=""/>
+      <w:lvlJc w:val="left"/>
+      <w:pPr>
+        <w:ind w:left="3560" w:hanging="360"/>
+      </w:pPr>
+      <w:rPr>
+        <w:rFonts w:ascii="Symbol" w:hAnsi="Symbol" w:hint="default"/>
+      </w:rPr>
+    </w:lvl>
+    <w:lvl w:ilvl="4" w:tplc="04090003" w:tentative="1">
+      <w:start w:val="1"/>
+      <w:numFmt w:val="bullet"/>
+      <w:lvlText w:val="o"/>
+      <w:lvlJc w:val="left"/>
+      <w:pPr>
+        <w:ind w:left="4280" w:hanging="360"/>
+      </w:pPr>
+      <w:rPr>
+        <w:rFonts w:ascii="Courier New" w:hAnsi="Courier New" w:cs="Courier New" w:hint="default"/>
+      </w:rPr>
+    </w:lvl>
+    <w:lvl w:ilvl="5" w:tplc="04090005" w:tentative="1">
+      <w:start w:val="1"/>
+      <w:numFmt w:val="bullet"/>
+      <w:lvlText w:val=""/>
+      <w:lvlJc w:val="left"/>
+      <w:pPr>
+        <w:ind w:left="5000" w:hanging="360"/>
+      </w:pPr>
+      <w:rPr>
+        <w:rFonts w:ascii="Wingdings" w:hAnsi="Wingdings" w:hint="default"/>
+      </w:rPr>
+    </w:lvl>
+    <w:lvl w:ilvl="6" w:tplc="04090001" w:tentative="1">
+      <w:start w:val="1"/>
+      <w:numFmt w:val="bullet"/>
+      <w:lvlText w:val=""/>
+      <w:lvlJc w:val="left"/>
+      <w:pPr>
+        <w:ind w:left="5720" w:hanging="360"/>
+      </w:pPr>
+      <w:rPr>
+        <w:rFonts w:ascii="Symbol" w:hAnsi="Symbol" w:hint="default"/>
+      </w:rPr>
+    </w:lvl>
+    <w:lvl w:ilvl="7" w:tplc="04090003" w:tentative="1">
+      <w:start w:val="1"/>
+      <w:numFmt w:val="bullet"/>
+      <w:lvlText w:val="o"/>
+      <w:lvlJc w:val="left"/>
+      <w:pPr>
+        <w:ind w:left="6440" w:hanging="360"/>
+      </w:pPr>
+      <w:rPr>
+        <w:rFonts w:ascii="Courier New" w:hAnsi="Courier New" w:cs="Courier New" w:hint="default"/>
+      </w:rPr>
+    </w:lvl>
+    <w:lvl w:ilvl="8" w:tplc="04090005" w:tentative="1">
+      <w:start w:val="1"/>
+      <w:numFmt w:val="bullet"/>
+      <w:lvlText w:val=""/>
+      <w:lvlJc w:val="left"/>
+      <w:pPr>
+        <w:ind w:left="7160" w:hanging="360"/>
+      </w:pPr>
+      <w:rPr>
+        <w:rFonts w:ascii="Wingdings" w:hAnsi="Wingdings" w:hint="default"/>
+      </w:rPr>
+    </w:lvl>
+  </w:abstractNum>
+  <w:abstractNum w:abstractNumId="33" w15:restartNumberingAfterBreak="0">
     <w:nsid w:val="5DB7072A"/>
     <w:multiLevelType w:val="hybridMultilevel"/>
     <w:tmpl w:val="2A927D7A"/>
@@ -26473,7 +26621,7 @@
       </w:rPr>
     </w:lvl>
   </w:abstractNum>
-  <w:abstractNum w:abstractNumId="33" w15:restartNumberingAfterBreak="0">
+  <w:abstractNum w:abstractNumId="34" w15:restartNumberingAfterBreak="0">
     <w:nsid w:val="5E384DA9"/>
     <w:multiLevelType w:val="hybridMultilevel"/>
     <w:tmpl w:val="3C469678"/>
@@ -26585,7 +26733,7 @@
       </w:rPr>
     </w:lvl>
   </w:abstractNum>
-  <w:abstractNum w:abstractNumId="34" w15:restartNumberingAfterBreak="0">
+  <w:abstractNum w:abstractNumId="35" w15:restartNumberingAfterBreak="0">
     <w:nsid w:val="5EB505C1"/>
     <w:multiLevelType w:val="hybridMultilevel"/>
     <w:tmpl w:val="FF96E498"/>
@@ -26697,7 +26845,7 @@
       </w:rPr>
     </w:lvl>
   </w:abstractNum>
-  <w:abstractNum w:abstractNumId="35" w15:restartNumberingAfterBreak="0">
+  <w:abstractNum w:abstractNumId="36" w15:restartNumberingAfterBreak="0">
     <w:nsid w:val="61FF38B3"/>
     <w:multiLevelType w:val="hybridMultilevel"/>
     <w:tmpl w:val="D1F67A48"/>
@@ -26809,7 +26957,7 @@
       </w:rPr>
     </w:lvl>
   </w:abstractNum>
-  <w:abstractNum w:abstractNumId="36" w15:restartNumberingAfterBreak="0">
+  <w:abstractNum w:abstractNumId="37" w15:restartNumberingAfterBreak="0">
     <w:nsid w:val="62011DEA"/>
     <w:multiLevelType w:val="hybridMultilevel"/>
     <w:tmpl w:val="8F9E43D0"/>
@@ -26921,7 +27069,7 @@
       </w:rPr>
     </w:lvl>
   </w:abstractNum>
-  <w:abstractNum w:abstractNumId="37" w15:restartNumberingAfterBreak="0">
+  <w:abstractNum w:abstractNumId="38" w15:restartNumberingAfterBreak="0">
     <w:nsid w:val="62A52E03"/>
     <w:multiLevelType w:val="hybridMultilevel"/>
     <w:tmpl w:val="ABB241BA"/>
@@ -27033,7 +27181,7 @@
       </w:rPr>
     </w:lvl>
   </w:abstractNum>
-  <w:abstractNum w:abstractNumId="38" w15:restartNumberingAfterBreak="0">
+  <w:abstractNum w:abstractNumId="39" w15:restartNumberingAfterBreak="0">
     <w:nsid w:val="64D80369"/>
     <w:multiLevelType w:val="hybridMultilevel"/>
     <w:tmpl w:val="D2B04AD8"/>
@@ -27145,7 +27293,7 @@
       </w:rPr>
     </w:lvl>
   </w:abstractNum>
-  <w:abstractNum w:abstractNumId="39" w15:restartNumberingAfterBreak="0">
+  <w:abstractNum w:abstractNumId="40" w15:restartNumberingAfterBreak="0">
     <w:nsid w:val="688B6BF0"/>
     <w:multiLevelType w:val="hybridMultilevel"/>
     <w:tmpl w:val="2C32FE74"/>
@@ -27257,7 +27405,7 @@
       </w:rPr>
     </w:lvl>
   </w:abstractNum>
-  <w:abstractNum w:abstractNumId="40" w15:restartNumberingAfterBreak="0">
+  <w:abstractNum w:abstractNumId="41" w15:restartNumberingAfterBreak="0">
     <w:nsid w:val="69F367D8"/>
     <w:multiLevelType w:val="hybridMultilevel"/>
     <w:tmpl w:val="0AA4A466"/>
@@ -27369,7 +27517,7 @@
       </w:rPr>
     </w:lvl>
   </w:abstractNum>
-  <w:abstractNum w:abstractNumId="41" w15:restartNumberingAfterBreak="0">
+  <w:abstractNum w:abstractNumId="42" w15:restartNumberingAfterBreak="0">
     <w:nsid w:val="6F211126"/>
     <w:multiLevelType w:val="hybridMultilevel"/>
     <w:tmpl w:val="57141262"/>
@@ -27481,7 +27629,7 @@
       </w:rPr>
     </w:lvl>
   </w:abstractNum>
-  <w:abstractNum w:abstractNumId="42" w15:restartNumberingAfterBreak="0">
+  <w:abstractNum w:abstractNumId="43" w15:restartNumberingAfterBreak="0">
     <w:nsid w:val="6F527102"/>
     <w:multiLevelType w:val="multilevel"/>
     <w:tmpl w:val="BCCA4298"/>
@@ -27629,7 +27777,7 @@
       </w:rPr>
     </w:lvl>
   </w:abstractNum>
-  <w:abstractNum w:abstractNumId="43" w15:restartNumberingAfterBreak="0">
+  <w:abstractNum w:abstractNumId="44" w15:restartNumberingAfterBreak="0">
     <w:nsid w:val="71DD7BE1"/>
     <w:multiLevelType w:val="hybridMultilevel"/>
     <w:tmpl w:val="71F09D0C"/>
@@ -27741,7 +27889,7 @@
       </w:rPr>
     </w:lvl>
   </w:abstractNum>
-  <w:abstractNum w:abstractNumId="44" w15:restartNumberingAfterBreak="0">
+  <w:abstractNum w:abstractNumId="45" w15:restartNumberingAfterBreak="0">
     <w:nsid w:val="75157E82"/>
     <w:multiLevelType w:val="hybridMultilevel"/>
     <w:tmpl w:val="1A9EA890"/>
@@ -27853,7 +28001,7 @@
       </w:rPr>
     </w:lvl>
   </w:abstractNum>
-  <w:abstractNum w:abstractNumId="45" w15:restartNumberingAfterBreak="0">
+  <w:abstractNum w:abstractNumId="46" w15:restartNumberingAfterBreak="0">
     <w:nsid w:val="755F1D41"/>
     <w:multiLevelType w:val="hybridMultilevel"/>
     <w:tmpl w:val="FA401344"/>
@@ -27965,7 +28113,7 @@
       </w:rPr>
     </w:lvl>
   </w:abstractNum>
-  <w:abstractNum w:abstractNumId="46" w15:restartNumberingAfterBreak="0">
+  <w:abstractNum w:abstractNumId="47" w15:restartNumberingAfterBreak="0">
     <w:nsid w:val="757026C0"/>
     <w:multiLevelType w:val="hybridMultilevel"/>
     <w:tmpl w:val="EAF8E45E"/>
@@ -28077,7 +28225,7 @@
       </w:rPr>
     </w:lvl>
   </w:abstractNum>
-  <w:abstractNum w:abstractNumId="47" w15:restartNumberingAfterBreak="0">
+  <w:abstractNum w:abstractNumId="48" w15:restartNumberingAfterBreak="0">
     <w:nsid w:val="76212D92"/>
     <w:multiLevelType w:val="multilevel"/>
     <w:tmpl w:val="F274DF72"/>
@@ -28225,7 +28373,7 @@
       </w:rPr>
     </w:lvl>
   </w:abstractNum>
-  <w:abstractNum w:abstractNumId="48" w15:restartNumberingAfterBreak="0">
+  <w:abstractNum w:abstractNumId="49" w15:restartNumberingAfterBreak="0">
     <w:nsid w:val="7A5B3900"/>
     <w:multiLevelType w:val="hybridMultilevel"/>
     <w:tmpl w:val="7D886498"/>
@@ -28337,7 +28485,119 @@
       </w:rPr>
     </w:lvl>
   </w:abstractNum>
-  <w:abstractNum w:abstractNumId="49" w15:restartNumberingAfterBreak="0">
+  <w:abstractNum w:abstractNumId="50" w15:restartNumberingAfterBreak="0">
+    <w:nsid w:val="7B8C09CB"/>
+    <w:multiLevelType w:val="hybridMultilevel"/>
+    <w:tmpl w:val="ACD01BBC"/>
+    <w:lvl w:ilvl="0" w:tplc="FB406BF4">
+      <w:numFmt w:val="bullet"/>
+      <w:lvlText w:val="-"/>
+      <w:lvlJc w:val="left"/>
+      <w:pPr>
+        <w:ind w:left="1400" w:hanging="360"/>
+      </w:pPr>
+      <w:rPr>
+        <w:rFonts w:ascii="Aptos" w:eastAsiaTheme="minorHAnsi" w:hAnsi="Aptos" w:cstheme="minorBidi" w:hint="default"/>
+      </w:rPr>
+    </w:lvl>
+    <w:lvl w:ilvl="1" w:tplc="04090003" w:tentative="1">
+      <w:start w:val="1"/>
+      <w:numFmt w:val="bullet"/>
+      <w:lvlText w:val="o"/>
+      <w:lvlJc w:val="left"/>
+      <w:pPr>
+        <w:ind w:left="2120" w:hanging="360"/>
+      </w:pPr>
+      <w:rPr>
+        <w:rFonts w:ascii="Courier New" w:hAnsi="Courier New" w:cs="Courier New" w:hint="default"/>
+      </w:rPr>
+    </w:lvl>
+    <w:lvl w:ilvl="2" w:tplc="04090005" w:tentative="1">
+      <w:start w:val="1"/>
+      <w:numFmt w:val="bullet"/>
+      <w:lvlText w:val=""/>
+      <w:lvlJc w:val="left"/>
+      <w:pPr>
+        <w:ind w:left="2840" w:hanging="360"/>
+      </w:pPr>
+      <w:rPr>
+        <w:rFonts w:ascii="Wingdings" w:hAnsi="Wingdings" w:hint="default"/>
+      </w:rPr>
+    </w:lvl>
+    <w:lvl w:ilvl="3" w:tplc="04090001" w:tentative="1">
+      <w:start w:val="1"/>
+      <w:numFmt w:val="bullet"/>
+      <w:lvlText w:val=""/>
+      <w:lvlJc w:val="left"/>
+      <w:pPr>
+        <w:ind w:left="3560" w:hanging="360"/>
+      </w:pPr>
+      <w:rPr>
+        <w:rFonts w:ascii="Symbol" w:hAnsi="Symbol" w:hint="default"/>
+      </w:rPr>
+    </w:lvl>
+    <w:lvl w:ilvl="4" w:tplc="04090003" w:tentative="1">
+      <w:start w:val="1"/>
+      <w:numFmt w:val="bullet"/>
+      <w:lvlText w:val="o"/>
+      <w:lvlJc w:val="left"/>
+      <w:pPr>
+        <w:ind w:left="4280" w:hanging="360"/>
+      </w:pPr>
+      <w:rPr>
+        <w:rFonts w:ascii="Courier New" w:hAnsi="Courier New" w:cs="Courier New" w:hint="default"/>
+      </w:rPr>
+    </w:lvl>
+    <w:lvl w:ilvl="5" w:tplc="04090005" w:tentative="1">
+      <w:start w:val="1"/>
+      <w:numFmt w:val="bullet"/>
+      <w:lvlText w:val=""/>
+      <w:lvlJc w:val="left"/>
+      <w:pPr>
+        <w:ind w:left="5000" w:hanging="360"/>
+      </w:pPr>
+      <w:rPr>
+        <w:rFonts w:ascii="Wingdings" w:hAnsi="Wingdings" w:hint="default"/>
+      </w:rPr>
+    </w:lvl>
+    <w:lvl w:ilvl="6" w:tplc="04090001" w:tentative="1">
+      <w:start w:val="1"/>
+      <w:numFmt w:val="bullet"/>
+      <w:lvlText w:val=""/>
+      <w:lvlJc w:val="left"/>
+      <w:pPr>
+        <w:ind w:left="5720" w:hanging="360"/>
+      </w:pPr>
+      <w:rPr>
+        <w:rFonts w:ascii="Symbol" w:hAnsi="Symbol" w:hint="default"/>
+      </w:rPr>
+    </w:lvl>
+    <w:lvl w:ilvl="7" w:tplc="04090003" w:tentative="1">
+      <w:start w:val="1"/>
+      <w:numFmt w:val="bullet"/>
+      <w:lvlText w:val="o"/>
+      <w:lvlJc w:val="left"/>
+      <w:pPr>
+        <w:ind w:left="6440" w:hanging="360"/>
+      </w:pPr>
+      <w:rPr>
+        <w:rFonts w:ascii="Courier New" w:hAnsi="Courier New" w:cs="Courier New" w:hint="default"/>
+      </w:rPr>
+    </w:lvl>
+    <w:lvl w:ilvl="8" w:tplc="04090005" w:tentative="1">
+      <w:start w:val="1"/>
+      <w:numFmt w:val="bullet"/>
+      <w:lvlText w:val=""/>
+      <w:lvlJc w:val="left"/>
+      <w:pPr>
+        <w:ind w:left="7160" w:hanging="360"/>
+      </w:pPr>
+      <w:rPr>
+        <w:rFonts w:ascii="Wingdings" w:hAnsi="Wingdings" w:hint="default"/>
+      </w:rPr>
+    </w:lvl>
+  </w:abstractNum>
+  <w:abstractNum w:abstractNumId="51" w15:restartNumberingAfterBreak="0">
     <w:nsid w:val="7C8F4C02"/>
     <w:multiLevelType w:val="multilevel"/>
     <w:tmpl w:val="1A8A96EC"/>
@@ -28475,7 +28735,7 @@
       </w:rPr>
     </w:lvl>
   </w:abstractNum>
-  <w:abstractNum w:abstractNumId="50" w15:restartNumberingAfterBreak="0">
+  <w:abstractNum w:abstractNumId="52" w15:restartNumberingAfterBreak="0">
     <w:nsid w:val="7DFC0A4C"/>
     <w:multiLevelType w:val="hybridMultilevel"/>
     <w:tmpl w:val="091E243C"/>
@@ -28587,7 +28847,7 @@
       </w:rPr>
     </w:lvl>
   </w:abstractNum>
-  <w:abstractNum w:abstractNumId="51" w15:restartNumberingAfterBreak="0">
+  <w:abstractNum w:abstractNumId="53" w15:restartNumberingAfterBreak="0">
     <w:nsid w:val="7F651757"/>
     <w:multiLevelType w:val="hybridMultilevel"/>
     <w:tmpl w:val="F5E8718E"/>
@@ -28700,13 +28960,13 @@
     </w:lvl>
   </w:abstractNum>
   <w:num w:numId="1" w16cid:durableId="1805730483">
-    <w:abstractNumId w:val="49"/>
+    <w:abstractNumId w:val="51"/>
   </w:num>
   <w:num w:numId="2" w16cid:durableId="608244835">
-    <w:abstractNumId w:val="42"/>
+    <w:abstractNumId w:val="43"/>
   </w:num>
   <w:num w:numId="3" w16cid:durableId="2013995386">
-    <w:abstractNumId w:val="47"/>
+    <w:abstractNumId w:val="48"/>
   </w:num>
   <w:num w:numId="4" w16cid:durableId="249126764">
     <w:abstractNumId w:val="18"/>
@@ -28715,19 +28975,19 @@
     <w:abstractNumId w:val="12"/>
   </w:num>
   <w:num w:numId="6" w16cid:durableId="413017549">
-    <w:abstractNumId w:val="44"/>
+    <w:abstractNumId w:val="45"/>
   </w:num>
   <w:num w:numId="7" w16cid:durableId="95102207">
-    <w:abstractNumId w:val="40"/>
+    <w:abstractNumId w:val="41"/>
   </w:num>
   <w:num w:numId="8" w16cid:durableId="1466582590">
-    <w:abstractNumId w:val="46"/>
+    <w:abstractNumId w:val="47"/>
   </w:num>
   <w:num w:numId="9" w16cid:durableId="1056049227">
     <w:abstractNumId w:val="5"/>
   </w:num>
   <w:num w:numId="10" w16cid:durableId="742219285">
-    <w:abstractNumId w:val="39"/>
+    <w:abstractNumId w:val="40"/>
   </w:num>
   <w:num w:numId="11" w16cid:durableId="1464303451">
     <w:abstractNumId w:val="6"/>
@@ -28754,7 +29014,7 @@
     <w:abstractNumId w:val="22"/>
   </w:num>
   <w:num w:numId="19" w16cid:durableId="1737505393">
-    <w:abstractNumId w:val="48"/>
+    <w:abstractNumId w:val="49"/>
   </w:num>
   <w:num w:numId="20" w16cid:durableId="225262269">
     <w:abstractNumId w:val="13"/>
@@ -28763,22 +29023,22 @@
     <w:abstractNumId w:val="16"/>
   </w:num>
   <w:num w:numId="22" w16cid:durableId="481628116">
-    <w:abstractNumId w:val="51"/>
+    <w:abstractNumId w:val="53"/>
   </w:num>
   <w:num w:numId="23" w16cid:durableId="1467505401">
     <w:abstractNumId w:val="20"/>
   </w:num>
   <w:num w:numId="24" w16cid:durableId="251621022">
-    <w:abstractNumId w:val="38"/>
+    <w:abstractNumId w:val="39"/>
   </w:num>
   <w:num w:numId="25" w16cid:durableId="1600597330">
-    <w:abstractNumId w:val="35"/>
+    <w:abstractNumId w:val="36"/>
   </w:num>
   <w:num w:numId="26" w16cid:durableId="1751003337">
     <w:abstractNumId w:val="17"/>
   </w:num>
   <w:num w:numId="27" w16cid:durableId="78599933">
-    <w:abstractNumId w:val="32"/>
+    <w:abstractNumId w:val="33"/>
   </w:num>
   <w:num w:numId="28" w16cid:durableId="1337345367">
     <w:abstractNumId w:val="25"/>
@@ -28790,22 +29050,22 @@
     <w:abstractNumId w:val="0"/>
   </w:num>
   <w:num w:numId="31" w16cid:durableId="1938322805">
-    <w:abstractNumId w:val="36"/>
+    <w:abstractNumId w:val="37"/>
   </w:num>
   <w:num w:numId="32" w16cid:durableId="395711613">
-    <w:abstractNumId w:val="41"/>
+    <w:abstractNumId w:val="42"/>
   </w:num>
   <w:num w:numId="33" w16cid:durableId="544217307">
     <w:abstractNumId w:val="21"/>
   </w:num>
   <w:num w:numId="34" w16cid:durableId="178931149">
-    <w:abstractNumId w:val="45"/>
+    <w:abstractNumId w:val="46"/>
   </w:num>
   <w:num w:numId="35" w16cid:durableId="923995956">
     <w:abstractNumId w:val="11"/>
   </w:num>
   <w:num w:numId="36" w16cid:durableId="238944916">
-    <w:abstractNumId w:val="33"/>
+    <w:abstractNumId w:val="34"/>
   </w:num>
   <w:num w:numId="37" w16cid:durableId="955134074">
     <w:abstractNumId w:val="29"/>
@@ -28814,13 +29074,13 @@
     <w:abstractNumId w:val="2"/>
   </w:num>
   <w:num w:numId="39" w16cid:durableId="735668641">
-    <w:abstractNumId w:val="50"/>
+    <w:abstractNumId w:val="52"/>
   </w:num>
   <w:num w:numId="40" w16cid:durableId="1033773519">
     <w:abstractNumId w:val="9"/>
   </w:num>
   <w:num w:numId="41" w16cid:durableId="167141067">
-    <w:abstractNumId w:val="34"/>
+    <w:abstractNumId w:val="35"/>
   </w:num>
   <w:num w:numId="42" w16cid:durableId="48654798">
     <w:abstractNumId w:val="15"/>
@@ -28844,7 +29104,7 @@
     <w:abstractNumId w:val="31"/>
   </w:num>
   <w:num w:numId="49" w16cid:durableId="1121801370">
-    <w:abstractNumId w:val="37"/>
+    <w:abstractNumId w:val="38"/>
   </w:num>
   <w:num w:numId="50" w16cid:durableId="1729189604">
     <w:abstractNumId w:val="19"/>
@@ -28853,7 +29113,13 @@
     <w:abstractNumId w:val="4"/>
   </w:num>
   <w:num w:numId="52" w16cid:durableId="1855076401">
-    <w:abstractNumId w:val="43"/>
+    <w:abstractNumId w:val="44"/>
+  </w:num>
+  <w:num w:numId="53" w16cid:durableId="1898517670">
+    <w:abstractNumId w:val="32"/>
+  </w:num>
+  <w:num w:numId="54" w16cid:durableId="742872489">
+    <w:abstractNumId w:val="50"/>
   </w:num>
   <w:numIdMacAtCleanup w:val="51"/>
 </w:numbering>

</xml_diff>

<commit_message>
Update some small weakness
</commit_message>
<xml_diff>
--- a/assets/thesis/ElectronicProductsStaticWebsite.docx
+++ b/assets/thesis/ElectronicProductsStaticWebsite.docx
@@ -1264,13 +1264,7 @@
               <w:jc w:val="center"/>
             </w:pPr>
             <w:r>
-              <w:t xml:space="preserve">Vĩnh Long, ngày .... tháng </w:t>
-            </w:r>
-            <w:r>
-              <w:t>0</w:t>
-            </w:r>
-            <w:r>
-              <w:t>6 năm 2026</w:t>
+              <w:t>Vĩnh Long, ngày .... tháng 06 năm 2026</w:t>
             </w:r>
           </w:p>
         </w:tc>
@@ -10290,6 +10284,9 @@
       <w:r>
         <w:t>Hỗ trợ liên kết (Hypertext)</w:t>
       </w:r>
+      <w:r>
+        <w:t>:</w:t>
+      </w:r>
     </w:p>
     <w:p>
       <w:pPr>
@@ -10321,7 +10318,10 @@
         <w:pStyle w:val="noidung"/>
       </w:pPr>
       <w:r>
-        <w:t>Nền tảng cho các công nghệ khác</w:t>
+        <w:t xml:space="preserve">Nền tảng cho các công nghệ </w:t>
+      </w:r>
+      <w:r>
+        <w:t>khác:</w:t>
       </w:r>
     </w:p>
     <w:p>
@@ -10353,7 +10353,10 @@
         <w:pStyle w:val="noidung"/>
       </w:pPr>
       <w:r>
-        <w:t>Khả năng mở rộng và tương thích</w:t>
+        <w:t xml:space="preserve">Khả năng mở rộng và tương </w:t>
+      </w:r>
+      <w:r>
+        <w:t>thích:</w:t>
       </w:r>
     </w:p>
     <w:p>
@@ -20010,6 +20013,7 @@
           </w:tcPr>
           <w:p>
             <w:r>
+              <w:lastRenderedPageBreak/>
               <w:t>20</w:t>
             </w:r>
           </w:p>
@@ -21236,7 +21240,7 @@
       <w:r>
         <w:lastRenderedPageBreak/>
         <w:drawing>
-          <wp:inline distT="0" distB="0" distL="0" distR="0" wp14:anchorId="2BBEE878" wp14:editId="1AA571D5">
+          <wp:inline distT="0" distB="0" distL="0" distR="0" wp14:anchorId="2BBEE878" wp14:editId="056223E7">
             <wp:extent cx="5115882" cy="2604888"/>
             <wp:effectExtent l="0" t="0" r="8890" b="5080"/>
             <wp:docPr id="1707564107" name="Picture 3"/>
@@ -29770,6 +29774,7 @@
   <w:style w:type="character" w:default="1" w:styleId="DefaultParagraphFont">
     <w:name w:val="Default Paragraph Font"/>
     <w:uiPriority w:val="1"/>
+    <w:semiHidden/>
     <w:unhideWhenUsed/>
   </w:style>
   <w:style w:type="table" w:default="1" w:styleId="TableNormal">

</xml_diff>